<commit_message>
Report the readiness assessment as findings rather than scores
The framework asks for a score out of five but never defines what each point
means, so any number was going to be my scale rather than SAP's. Scores also
draw the conversation onto whether governance is a 1 or a 2, when the useful
output is that nothing assigns an owner to any entity and there is no
catalogue at all.

Each dimension is now written as a finding with its evidence: what is in
place, what is missing, and where a criterion had to be answered on a
substitute because it assumes a legacy estate we do not have. Nothing was
softened in the rewrite - the governance section still says the quality check
records SAP's totals without ever comparing them, and still says a recorded
figure is not a control.

The conclusion is unchanged and now stated in words: four dimensions in
reasonable shape, one that is not, and it is governance.
</commit_message>
<xml_diff>
--- a/docs/SMart_BDC_Readiness_and_Architecture.docx
+++ b/docs/SMart_BDC_Readiness_and_Architecture.docx
@@ -58,7 +58,7 @@
           <w:color w:val="1D1D1D"/>
           <w:sz w:val="27"/>
         </w:rPr>
-        <w:t>1. Purpose and honest framing</w:t>
+        <w:t>1. Purpose and framing</w:t>
       </w:r>
     </w:p>
     <w:p>
@@ -106,7 +106,7 @@
           <w:color w:val="1D1D1D"/>
           <w:sz w:val="21"/>
         </w:rPr>
-        <w:t>Rather than skip them, each is scored on the closest honest equivalent and the substitution is</w:t>
+        <w:t>This assessment works through all five dimensions anyway, on the closest honest equivalent, and</w:t>
       </w:r>
     </w:p>
     <w:p>
@@ -118,7 +118,7 @@
           <w:color w:val="1D1D1D"/>
           <w:sz w:val="21"/>
         </w:rPr>
-        <w:t>stated. Where a criterion cannot be answered at all, it is scored N/A and excluded from the</w:t>
+        <w:t>says so wherever a criterion has been substituted or cannot be answered at all. It is written as</w:t>
       </w:r>
     </w:p>
     <w:p>
@@ -130,7 +130,7 @@
           <w:color w:val="1D1D1D"/>
           <w:sz w:val="21"/>
         </w:rPr>
-        <w:t>dimension average rather than counted as full marks. Scoring a demo five out of five for having</w:t>
+        <w:t>findings rather than scores: a number out of five invites an argument about the number, and the</w:t>
       </w:r>
     </w:p>
     <w:p>
@@ -142,7 +142,7 @@
           <w:color w:val="1D1D1D"/>
           <w:sz w:val="21"/>
         </w:rPr>
-        <w:t>no BW complexity would flatter the exercise and teach nobody anything.</w:t>
+        <w:t>useful output here is what is actually missing.</w:t>
       </w:r>
     </w:p>
     <w:p>
@@ -154,55 +154,7 @@
           <w:color w:val="1D1D1D"/>
           <w:sz w:val="21"/>
         </w:rPr>
-        <w:t>The framework asks for a score out of 5 but does not define what each point means, so this</w:t>
-      </w:r>
-    </w:p>
-    <w:p>
-      <w:pPr>
-        <w:spacing w:after="140"/>
-      </w:pPr>
-      <w:r>
-        <w:rPr>
-          <w:color w:val="1D1D1D"/>
-          <w:sz w:val="21"/>
-        </w:rPr>
-        <w:t>assessment uses its own scale, stated here so the numbers can be challenged: **1 = absent,</w:t>
-      </w:r>
-    </w:p>
-    <w:p>
-      <w:pPr>
-        <w:spacing w:after="140"/>
-      </w:pPr>
-      <w:r>
-        <w:rPr>
-          <w:color w:val="1D1D1D"/>
-          <w:sz w:val="21"/>
-        </w:rPr>
-        <w:t>2 = done but with no process behind it, 3 = a real control exists but is narrow, 4 = systematic</w:t>
-      </w:r>
-    </w:p>
-    <w:p>
-      <w:pPr>
-        <w:spacing w:after="140"/>
-      </w:pPr>
-      <w:r>
-        <w:rPr>
-          <w:color w:val="1D1D1D"/>
-          <w:sz w:val="21"/>
-        </w:rPr>
-        <w:t>with gaps, 5 = established and monitored.** Each dimension is the mean of its scored criteria.</w:t>
-      </w:r>
-    </w:p>
-    <w:p>
-      <w:pPr>
-        <w:spacing w:after="140"/>
-      </w:pPr>
-      <w:r>
-        <w:rPr>
-          <w:color w:val="1D1D1D"/>
-          <w:sz w:val="21"/>
-        </w:rPr>
-        <w:t>The result is more useful than a flattering one: the framework, applied honestly, identifies a</w:t>
+        <w:t>The result is more useful than a flattering one. Applied honestly, the framework identifies a</w:t>
       </w:r>
     </w:p>
     <w:p>
@@ -227,7 +179,7 @@
           <w:color w:val="1D1D1D"/>
           <w:sz w:val="27"/>
         </w:rPr>
-        <w:t>2. Readiness scorecard</w:t>
+        <w:t>2. Readiness assessment</w:t>
       </w:r>
     </w:p>
     <w:p>
@@ -240,362 +192,27 @@
           <w:color w:val="1D1D1D"/>
           <w:sz w:val="23"/>
         </w:rPr>
-        <w:t>Dimension 1 — Data architecture readiness: **3.5 / 5**</w:t>
+        <w:t>Dimension 1 — Data architecture readiness</w:t>
       </w:r>
     </w:p>
-    <w:tbl>
-      <w:tblPr>
-        <w:tblW w:type="auto" w:w="0"/>
-        <w:jc w:val="center"/>
-        <w:tblLook w:firstColumn="1" w:firstRow="1" w:lastColumn="0" w:lastRow="0" w:noHBand="0" w:noVBand="1" w:val="04A0"/>
-        <w:tblBorders>
-          <w:top w:val="single" w:sz="4" w:color="BFBFBF"/>
-          <w:left w:val="single" w:sz="4" w:color="BFBFBF"/>
-          <w:bottom w:val="single" w:sz="4" w:color="BFBFBF"/>
-          <w:right w:val="single" w:sz="4" w:color="BFBFBF"/>
-          <w:insideH w:val="single" w:sz="4" w:color="BFBFBF"/>
-          <w:insideV w:val="single" w:sz="4" w:color="BFBFBF"/>
-        </w:tblBorders>
-      </w:tblPr>
-      <w:tblGrid>
-        <w:gridCol w:w="3216"/>
-        <w:gridCol w:w="3216"/>
-        <w:gridCol w:w="3216"/>
-      </w:tblGrid>
-      <w:tr>
-        <w:tc>
-          <w:tcPr>
-            <w:tcW w:type="dxa" w:w="3216"/>
-            <w:shd w:val="clear" w:fill="454545"/>
-          </w:tcPr>
-          <w:p>
-            <w:pPr>
-              <w:spacing w:before="40" w:after="40"/>
-            </w:pPr>
-            <w:r>
-              <w:rPr>
-                <w:b/>
-                <w:color w:val="FFFFFF"/>
-              </w:rPr>
-            </w:r>
-            <w:r>
-              <w:rPr>
-                <w:b/>
-                <w:color w:val="FFFFFF"/>
-                <w:sz w:val="19"/>
-              </w:rPr>
-              <w:t>Criterion</w:t>
-            </w:r>
-          </w:p>
-        </w:tc>
-        <w:tc>
-          <w:tcPr>
-            <w:tcW w:type="dxa" w:w="3216"/>
-            <w:shd w:val="clear" w:fill="454545"/>
-          </w:tcPr>
-          <w:p>
-            <w:pPr>
-              <w:spacing w:before="40" w:after="40"/>
-            </w:pPr>
-            <w:r>
-              <w:rPr>
-                <w:b/>
-                <w:color w:val="FFFFFF"/>
-              </w:rPr>
-            </w:r>
-            <w:r>
-              <w:rPr>
-                <w:b/>
-                <w:color w:val="FFFFFF"/>
-                <w:sz w:val="19"/>
-              </w:rPr>
-              <w:t>Assessment</w:t>
-            </w:r>
-          </w:p>
-        </w:tc>
-        <w:tc>
-          <w:tcPr>
-            <w:tcW w:type="dxa" w:w="3216"/>
-            <w:shd w:val="clear" w:fill="454545"/>
-          </w:tcPr>
-          <w:p>
-            <w:pPr>
-              <w:spacing w:before="40" w:after="40"/>
-            </w:pPr>
-            <w:r>
-              <w:rPr>
-                <w:b/>
-                <w:color w:val="FFFFFF"/>
-              </w:rPr>
-            </w:r>
-            <w:r>
-              <w:rPr>
-                <w:b/>
-                <w:color w:val="FFFFFF"/>
-                <w:sz w:val="19"/>
-              </w:rPr>
-              <w:t>Score</w:t>
-            </w:r>
-          </w:p>
-        </w:tc>
-      </w:tr>
-      <w:tr>
-        <w:tc>
-          <w:tcPr>
-            <w:tcW w:type="dxa" w:w="3216"/>
-          </w:tcPr>
-          <w:p>
-            <w:pPr>
-              <w:spacing w:before="40" w:after="40"/>
-            </w:pPr>
-            <w:r/>
-            <w:r>
-              <w:rPr>
-                <w:color w:val="1D1D1D"/>
-                <w:sz w:val="19"/>
-              </w:rPr>
-              <w:t>Current BW complexity</w:t>
-            </w:r>
-          </w:p>
-        </w:tc>
-        <w:tc>
-          <w:tcPr>
-            <w:tcW w:type="dxa" w:w="3216"/>
-          </w:tcPr>
-          <w:p>
-            <w:pPr>
-              <w:spacing w:before="40" w:after="40"/>
-            </w:pPr>
-            <w:r/>
-            <w:r>
-              <w:rPr>
-                <w:color w:val="1D1D1D"/>
-                <w:sz w:val="19"/>
-              </w:rPr>
-              <w:t>No BW estate. Nothing to untangle, nothing to migrate off.</w:t>
-            </w:r>
-          </w:p>
-        </w:tc>
-        <w:tc>
-          <w:tcPr>
-            <w:tcW w:type="dxa" w:w="3216"/>
-          </w:tcPr>
-          <w:p>
-            <w:pPr>
-              <w:spacing w:before="40" w:after="40"/>
-            </w:pPr>
-            <w:r/>
-            <w:r>
-              <w:rPr>
-                <w:color w:val="1D1D1D"/>
-                <w:sz w:val="19"/>
-              </w:rPr>
-              <w:t>N/A</w:t>
-            </w:r>
-          </w:p>
-        </w:tc>
-      </w:tr>
-      <w:tr>
-        <w:tc>
-          <w:tcPr>
-            <w:tcW w:type="dxa" w:w="3216"/>
-            <w:shd w:val="clear" w:fill="F4F4F4"/>
-          </w:tcPr>
-          <w:p>
-            <w:pPr>
-              <w:spacing w:before="40" w:after="40"/>
-            </w:pPr>
-            <w:r/>
-            <w:r>
-              <w:rPr>
-                <w:color w:val="1D1D1D"/>
-                <w:sz w:val="19"/>
-              </w:rPr>
-              <w:t>Data volumes and ingestion patterns</w:t>
-            </w:r>
-          </w:p>
-        </w:tc>
-        <w:tc>
-          <w:tcPr>
-            <w:tcW w:type="dxa" w:w="3216"/>
-            <w:shd w:val="clear" w:fill="F4F4F4"/>
-          </w:tcPr>
-          <w:p>
-            <w:pPr>
-              <w:spacing w:before="40" w:after="40"/>
-            </w:pPr>
-            <w:r/>
-            <w:r>
-              <w:rPr>
-                <w:color w:val="1D1D1D"/>
-                <w:sz w:val="19"/>
-              </w:rPr>
-              <w:t>25 tables, 120,324 rows in HANA Cloud. Incremental ingestion is supported and tested — the pipeline picks its primary source by row count rather than filename, and a single-day export exercises the delta path.</w:t>
-            </w:r>
-          </w:p>
-        </w:tc>
-        <w:tc>
-          <w:tcPr>
-            <w:tcW w:type="dxa" w:w="3216"/>
-            <w:shd w:val="clear" w:fill="F4F4F4"/>
-          </w:tcPr>
-          <w:p>
-            <w:pPr>
-              <w:spacing w:before="40" w:after="40"/>
-            </w:pPr>
-            <w:r/>
-            <w:r>
-              <w:rPr>
-                <w:color w:val="1D1D1D"/>
-                <w:sz w:val="19"/>
-              </w:rPr>
-              <w:t>4</w:t>
-            </w:r>
-          </w:p>
-        </w:tc>
-      </w:tr>
-      <w:tr>
-        <w:tc>
-          <w:tcPr>
-            <w:tcW w:type="dxa" w:w="3216"/>
-          </w:tcPr>
-          <w:p>
-            <w:pPr>
-              <w:spacing w:before="40" w:after="40"/>
-            </w:pPr>
-            <w:r/>
-            <w:r>
-              <w:rPr>
-                <w:color w:val="1D1D1D"/>
-                <w:sz w:val="19"/>
-              </w:rPr>
-              <w:t>ECC/S4 extraction landscape health</w:t>
-            </w:r>
-          </w:p>
-        </w:tc>
-        <w:tc>
-          <w:tcPr>
-            <w:tcW w:type="dxa" w:w="3216"/>
-          </w:tcPr>
-          <w:p>
-            <w:pPr>
-              <w:spacing w:before="40" w:after="40"/>
-            </w:pPr>
-            <w:r/>
-            <w:r>
-              <w:rPr>
-                <w:color w:val="1D1D1D"/>
-                <w:sz w:val="19"/>
-              </w:rPr>
-              <w:t xml:space="preserve">No extraction landscape. Source is a file-based SAP Customer Checkout export. Its figures reconciled exactly against the totals SAP prints in its own report when checked, and those totals are captured in </w:t>
-            </w:r>
-            <w:r>
-              <w:rPr>
-                <w:rFonts w:ascii="Consolas" w:hAnsi="Consolas"/>
-                <w:color w:val="1D1D1D"/>
-                <w:sz w:val="17"/>
-              </w:rPr>
-              <w:t>data/canonical/manifest.json</w:t>
-            </w:r>
-            <w:r>
-              <w:rPr>
-                <w:color w:val="1D1D1D"/>
-                <w:sz w:val="19"/>
-              </w:rPr>
-              <w:t xml:space="preserve"> on every run — but see dimension 2: the comparison is not automated.</w:t>
-            </w:r>
-          </w:p>
-        </w:tc>
-        <w:tc>
-          <w:tcPr>
-            <w:tcW w:type="dxa" w:w="3216"/>
-          </w:tcPr>
-          <w:p>
-            <w:pPr>
-              <w:spacing w:before="40" w:after="40"/>
-            </w:pPr>
-            <w:r/>
-            <w:r>
-              <w:rPr>
-                <w:color w:val="1D1D1D"/>
-                <w:sz w:val="19"/>
-              </w:rPr>
-              <w:t>3</w:t>
-            </w:r>
-          </w:p>
-        </w:tc>
-      </w:tr>
-      <w:tr>
-        <w:tc>
-          <w:tcPr>
-            <w:tcW w:type="dxa" w:w="3216"/>
-            <w:shd w:val="clear" w:fill="F4F4F4"/>
-          </w:tcPr>
-          <w:p>
-            <w:pPr>
-              <w:spacing w:before="40" w:after="40"/>
-            </w:pPr>
-            <w:r/>
-            <w:r>
-              <w:rPr>
-                <w:color w:val="1D1D1D"/>
-                <w:sz w:val="19"/>
-              </w:rPr>
-              <w:t>Custom ABAP / BAdI usage</w:t>
-            </w:r>
-          </w:p>
-        </w:tc>
-        <w:tc>
-          <w:tcPr>
-            <w:tcW w:type="dxa" w:w="3216"/>
-            <w:shd w:val="clear" w:fill="F4F4F4"/>
-          </w:tcPr>
-          <w:p>
-            <w:pPr>
-              <w:spacing w:before="40" w:after="40"/>
-            </w:pPr>
-            <w:r/>
-            <w:r>
-              <w:rPr>
-                <w:color w:val="1D1D1D"/>
-                <w:sz w:val="19"/>
-              </w:rPr>
-              <w:t>None. The whole stack is CAP, CDS and Node.js.</w:t>
-            </w:r>
-          </w:p>
-        </w:tc>
-        <w:tc>
-          <w:tcPr>
-            <w:tcW w:type="dxa" w:w="3216"/>
-            <w:shd w:val="clear" w:fill="F4F4F4"/>
-          </w:tcPr>
-          <w:p>
-            <w:pPr>
-              <w:spacing w:before="40" w:after="40"/>
-            </w:pPr>
-            <w:r/>
-            <w:r>
-              <w:rPr>
-                <w:color w:val="1D1D1D"/>
-                <w:sz w:val="19"/>
-              </w:rPr>
-              <w:t>N/A</w:t>
-            </w:r>
-          </w:p>
-        </w:tc>
-      </w:tr>
-    </w:tbl>
-    <w:p/>
     <w:p>
       <w:pPr>
         <w:spacing w:after="140"/>
       </w:pPr>
       <w:r>
         <w:rPr>
+          <w:b/>
           <w:color w:val="1D1D1D"/>
           <w:sz w:val="21"/>
         </w:rPr>
-        <w:t>The architecture is clean because it is new, not because it has been rationalised. That is worth</w:t>
+        <w:t>Strong, but for a reason that would not transfer to a customer.</w:t>
+      </w:r>
+      <w:r>
+        <w:rPr>
+          <w:color w:val="1D1D1D"/>
+          <w:sz w:val="21"/>
+        </w:rPr>
+        <w:t xml:space="preserve"> There is no BW estate to</w:t>
       </w:r>
     </w:p>
     <w:p>
@@ -607,7 +224,118 @@
           <w:color w:val="1D1D1D"/>
           <w:sz w:val="21"/>
         </w:rPr>
-        <w:t>saying plainly: this dimension scores well for a reason that would not transfer to a customer.</w:t>
+        <w:t>untangle and no custom ABAP, so two of the four criteria do not apply. Volumes and ingestion are</w:t>
+      </w:r>
+    </w:p>
+    <w:p>
+      <w:pPr>
+        <w:spacing w:after="140"/>
+      </w:pPr>
+      <w:r>
+        <w:rPr>
+          <w:color w:val="1D1D1D"/>
+          <w:sz w:val="21"/>
+        </w:rPr>
+        <w:t>in good shape: 25 tables and 120,324 rows deployed to HANA Cloud, with incremental ingestion</w:t>
+      </w:r>
+    </w:p>
+    <w:p>
+      <w:pPr>
+        <w:spacing w:after="140"/>
+      </w:pPr>
+      <w:r>
+        <w:rPr>
+          <w:color w:val="1D1D1D"/>
+          <w:sz w:val="21"/>
+        </w:rPr>
+        <w:t>supported and exercised — the pipeline picks its primary source by row count rather than</w:t>
+      </w:r>
+    </w:p>
+    <w:p>
+      <w:pPr>
+        <w:spacing w:after="140"/>
+      </w:pPr>
+      <w:r>
+        <w:rPr>
+          <w:color w:val="1D1D1D"/>
+          <w:sz w:val="21"/>
+        </w:rPr>
+        <w:t>filename, and a single-day export drives the delta path.</w:t>
+      </w:r>
+    </w:p>
+    <w:p>
+      <w:pPr>
+        <w:spacing w:after="140"/>
+      </w:pPr>
+      <w:r>
+        <w:rPr>
+          <w:color w:val="1D1D1D"/>
+          <w:sz w:val="21"/>
+        </w:rPr>
+        <w:t>There is no ECC or S/4 extraction landscape. The source is a file-based SAP Customer Checkout</w:t>
+      </w:r>
+    </w:p>
+    <w:p>
+      <w:pPr>
+        <w:spacing w:after="140"/>
+      </w:pPr>
+      <w:r>
+        <w:rPr>
+          <w:color w:val="1D1D1D"/>
+          <w:sz w:val="21"/>
+        </w:rPr>
+        <w:t>export whose figures reconciled exactly against the totals SAP prints in its own report when</w:t>
+      </w:r>
+    </w:p>
+    <w:p>
+      <w:pPr>
+        <w:spacing w:after="140"/>
+      </w:pPr>
+      <w:r>
+        <w:rPr>
+          <w:color w:val="1D1D1D"/>
+          <w:sz w:val="21"/>
+        </w:rPr>
+        <w:t xml:space="preserve">checked by hand, with those totals captured in </w:t>
+      </w:r>
+      <w:r>
+        <w:rPr>
+          <w:rFonts w:ascii="Consolas" w:hAnsi="Consolas"/>
+          <w:color w:val="1D1D1D"/>
+          <w:sz w:val="19"/>
+        </w:rPr>
+        <w:t>data/canonical/manifest.json</w:t>
+      </w:r>
+      <w:r>
+        <w:rPr>
+          <w:color w:val="1D1D1D"/>
+          <w:sz w:val="21"/>
+        </w:rPr>
+        <w:t xml:space="preserve"> on every run. The</w:t>
+      </w:r>
+    </w:p>
+    <w:p>
+      <w:pPr>
+        <w:spacing w:after="140"/>
+      </w:pPr>
+      <w:r>
+        <w:rPr>
+          <w:color w:val="1D1D1D"/>
+          <w:sz w:val="21"/>
+        </w:rPr>
+        <w:t>comparison itself is not automated, which is a dimension 2 problem.</w:t>
+      </w:r>
+    </w:p>
+    <w:p>
+      <w:pPr>
+        <w:spacing w:after="140"/>
+      </w:pPr>
+      <w:r>
+        <w:rPr>
+          <w:color w:val="1D1D1D"/>
+          <w:sz w:val="21"/>
+        </w:rPr>
+        <w:t>The architecture is clean because it is new, not because it has been rationalised.</w:t>
       </w:r>
     </w:p>
     <w:p>
@@ -620,352 +348,9 @@
           <w:color w:val="1D1D1D"/>
           <w:sz w:val="23"/>
         </w:rPr>
-        <w:t>Dimension 2 — Data governance and quality: **1.5 / 5**</w:t>
+        <w:t>Dimension 2 — Data governance and quality</w:t>
       </w:r>
     </w:p>
-    <w:tbl>
-      <w:tblPr>
-        <w:tblW w:type="auto" w:w="0"/>
-        <w:jc w:val="center"/>
-        <w:tblLook w:firstColumn="1" w:firstRow="1" w:lastColumn="0" w:lastRow="0" w:noHBand="0" w:noVBand="1" w:val="04A0"/>
-        <w:tblBorders>
-          <w:top w:val="single" w:sz="4" w:color="BFBFBF"/>
-          <w:left w:val="single" w:sz="4" w:color="BFBFBF"/>
-          <w:bottom w:val="single" w:sz="4" w:color="BFBFBF"/>
-          <w:right w:val="single" w:sz="4" w:color="BFBFBF"/>
-          <w:insideH w:val="single" w:sz="4" w:color="BFBFBF"/>
-          <w:insideV w:val="single" w:sz="4" w:color="BFBFBF"/>
-        </w:tblBorders>
-      </w:tblPr>
-      <w:tblGrid>
-        <w:gridCol w:w="3216"/>
-        <w:gridCol w:w="3216"/>
-        <w:gridCol w:w="3216"/>
-      </w:tblGrid>
-      <w:tr>
-        <w:tc>
-          <w:tcPr>
-            <w:tcW w:type="dxa" w:w="3216"/>
-            <w:shd w:val="clear" w:fill="454545"/>
-          </w:tcPr>
-          <w:p>
-            <w:pPr>
-              <w:spacing w:before="40" w:after="40"/>
-            </w:pPr>
-            <w:r>
-              <w:rPr>
-                <w:b/>
-                <w:color w:val="FFFFFF"/>
-              </w:rPr>
-            </w:r>
-            <w:r>
-              <w:rPr>
-                <w:b/>
-                <w:color w:val="FFFFFF"/>
-                <w:sz w:val="19"/>
-              </w:rPr>
-              <w:t>Criterion</w:t>
-            </w:r>
-          </w:p>
-        </w:tc>
-        <w:tc>
-          <w:tcPr>
-            <w:tcW w:type="dxa" w:w="3216"/>
-            <w:shd w:val="clear" w:fill="454545"/>
-          </w:tcPr>
-          <w:p>
-            <w:pPr>
-              <w:spacing w:before="40" w:after="40"/>
-            </w:pPr>
-            <w:r>
-              <w:rPr>
-                <w:b/>
-                <w:color w:val="FFFFFF"/>
-              </w:rPr>
-            </w:r>
-            <w:r>
-              <w:rPr>
-                <w:b/>
-                <w:color w:val="FFFFFF"/>
-                <w:sz w:val="19"/>
-              </w:rPr>
-              <w:t>Assessment</w:t>
-            </w:r>
-          </w:p>
-        </w:tc>
-        <w:tc>
-          <w:tcPr>
-            <w:tcW w:type="dxa" w:w="3216"/>
-            <w:shd w:val="clear" w:fill="454545"/>
-          </w:tcPr>
-          <w:p>
-            <w:pPr>
-              <w:spacing w:before="40" w:after="40"/>
-            </w:pPr>
-            <w:r>
-              <w:rPr>
-                <w:b/>
-                <w:color w:val="FFFFFF"/>
-              </w:rPr>
-            </w:r>
-            <w:r>
-              <w:rPr>
-                <w:b/>
-                <w:color w:val="FFFFFF"/>
-                <w:sz w:val="19"/>
-              </w:rPr>
-              <w:t>Score</w:t>
-            </w:r>
-          </w:p>
-        </w:tc>
-      </w:tr>
-      <w:tr>
-        <w:tc>
-          <w:tcPr>
-            <w:tcW w:type="dxa" w:w="3216"/>
-          </w:tcPr>
-          <w:p>
-            <w:pPr>
-              <w:spacing w:before="40" w:after="40"/>
-            </w:pPr>
-            <w:r/>
-            <w:r>
-              <w:rPr>
-                <w:color w:val="1D1D1D"/>
-                <w:sz w:val="19"/>
-              </w:rPr>
-              <w:t>Active data ownership structure</w:t>
-            </w:r>
-          </w:p>
-        </w:tc>
-        <w:tc>
-          <w:tcPr>
-            <w:tcW w:type="dxa" w:w="3216"/>
-          </w:tcPr>
-          <w:p>
-            <w:pPr>
-              <w:spacing w:before="40" w:after="40"/>
-            </w:pPr>
-            <w:r/>
-            <w:r>
-              <w:rPr>
-                <w:color w:val="1D1D1D"/>
-                <w:sz w:val="19"/>
-              </w:rPr>
-              <w:t>None. No owners, no stewards, no defined accountability for any entity.</w:t>
-            </w:r>
-          </w:p>
-        </w:tc>
-        <w:tc>
-          <w:tcPr>
-            <w:tcW w:type="dxa" w:w="3216"/>
-          </w:tcPr>
-          <w:p>
-            <w:pPr>
-              <w:spacing w:before="40" w:after="40"/>
-            </w:pPr>
-            <w:r/>
-            <w:r>
-              <w:rPr>
-                <w:color w:val="1D1D1D"/>
-                <w:sz w:val="19"/>
-              </w:rPr>
-              <w:t>1</w:t>
-            </w:r>
-          </w:p>
-        </w:tc>
-      </w:tr>
-      <w:tr>
-        <w:tc>
-          <w:tcPr>
-            <w:tcW w:type="dxa" w:w="3216"/>
-            <w:shd w:val="clear" w:fill="F4F4F4"/>
-          </w:tcPr>
-          <w:p>
-            <w:pPr>
-              <w:spacing w:before="40" w:after="40"/>
-            </w:pPr>
-            <w:r/>
-            <w:r>
-              <w:rPr>
-                <w:color w:val="1D1D1D"/>
-                <w:sz w:val="19"/>
-              </w:rPr>
-              <w:t>Master data governance maturity</w:t>
-            </w:r>
-          </w:p>
-        </w:tc>
-        <w:tc>
-          <w:tcPr>
-            <w:tcW w:type="dxa" w:w="3216"/>
-            <w:shd w:val="clear" w:fill="F4F4F4"/>
-          </w:tcPr>
-          <w:p>
-            <w:pPr>
-              <w:spacing w:before="40" w:after="40"/>
-            </w:pPr>
-            <w:r/>
-            <w:r>
-              <w:rPr>
-                <w:color w:val="1D1D1D"/>
-                <w:sz w:val="19"/>
-              </w:rPr>
-              <w:t>The article master was enriched by us — unit cost, temperature zone, shelf life, ABC class, RFID flag, reorder point, supplier — with no governance process behind any of it. The values are defensible; the process is absent.</w:t>
-            </w:r>
-          </w:p>
-        </w:tc>
-        <w:tc>
-          <w:tcPr>
-            <w:tcW w:type="dxa" w:w="3216"/>
-            <w:shd w:val="clear" w:fill="F4F4F4"/>
-          </w:tcPr>
-          <w:p>
-            <w:pPr>
-              <w:spacing w:before="40" w:after="40"/>
-            </w:pPr>
-            <w:r/>
-            <w:r>
-              <w:rPr>
-                <w:color w:val="1D1D1D"/>
-                <w:sz w:val="19"/>
-              </w:rPr>
-              <w:t>2</w:t>
-            </w:r>
-          </w:p>
-        </w:tc>
-      </w:tr>
-      <w:tr>
-        <w:tc>
-          <w:tcPr>
-            <w:tcW w:type="dxa" w:w="3216"/>
-          </w:tcPr>
-          <w:p>
-            <w:pPr>
-              <w:spacing w:before="40" w:after="40"/>
-            </w:pPr>
-            <w:r/>
-            <w:r>
-              <w:rPr>
-                <w:color w:val="1D1D1D"/>
-                <w:sz w:val="19"/>
-              </w:rPr>
-              <w:t>Data quality KPIs and monitoring</w:t>
-            </w:r>
-          </w:p>
-        </w:tc>
-        <w:tc>
-          <w:tcPr>
-            <w:tcW w:type="dxa" w:w="3216"/>
-          </w:tcPr>
-          <w:p>
-            <w:pPr>
-              <w:spacing w:before="40" w:after="40"/>
-            </w:pPr>
-            <w:r/>
-            <w:r>
-              <w:rPr>
-                <w:color w:val="1D1D1D"/>
-                <w:sz w:val="19"/>
-              </w:rPr>
-              <w:t xml:space="preserve">Weaker than it first appears. </w:t>
-            </w:r>
-            <w:r>
-              <w:rPr>
-                <w:rFonts w:ascii="Consolas" w:hAnsi="Consolas"/>
-                <w:color w:val="1D1D1D"/>
-                <w:sz w:val="17"/>
-              </w:rPr>
-              <w:t>extract_cashing_up()</w:t>
-            </w:r>
-            <w:r>
-              <w:rPr>
-                <w:color w:val="1D1D1D"/>
-                <w:sz w:val="19"/>
-              </w:rPr>
-              <w:t xml:space="preserve"> reads SAP's own totals into the manifest on every run, but nothing compares them to the extracted rows — there is no assertion and no failure on mismatch. The reconciliation was verified by hand once and recorded for inspection. A recorded figure is not a control.</w:t>
-            </w:r>
-          </w:p>
-        </w:tc>
-        <w:tc>
-          <w:tcPr>
-            <w:tcW w:type="dxa" w:w="3216"/>
-          </w:tcPr>
-          <w:p>
-            <w:pPr>
-              <w:spacing w:before="40" w:after="40"/>
-            </w:pPr>
-            <w:r/>
-            <w:r>
-              <w:rPr>
-                <w:color w:val="1D1D1D"/>
-                <w:sz w:val="19"/>
-              </w:rPr>
-              <w:t>2</w:t>
-            </w:r>
-          </w:p>
-        </w:tc>
-      </w:tr>
-      <w:tr>
-        <w:tc>
-          <w:tcPr>
-            <w:tcW w:type="dxa" w:w="3216"/>
-            <w:shd w:val="clear" w:fill="F4F4F4"/>
-          </w:tcPr>
-          <w:p>
-            <w:pPr>
-              <w:spacing w:before="40" w:after="40"/>
-            </w:pPr>
-            <w:r/>
-            <w:r>
-              <w:rPr>
-                <w:color w:val="1D1D1D"/>
-                <w:sz w:val="19"/>
-              </w:rPr>
-              <w:t>Catalogue and lineage tooling</w:t>
-            </w:r>
-          </w:p>
-        </w:tc>
-        <w:tc>
-          <w:tcPr>
-            <w:tcW w:type="dxa" w:w="3216"/>
-            <w:shd w:val="clear" w:fill="F4F4F4"/>
-          </w:tcPr>
-          <w:p>
-            <w:pPr>
-              <w:spacing w:before="40" w:after="40"/>
-            </w:pPr>
-            <w:r/>
-            <w:r>
-              <w:rPr>
-                <w:color w:val="1D1D1D"/>
-                <w:sz w:val="19"/>
-              </w:rPr>
-              <w:t>None. Lineage exists only as prose in the project report.</w:t>
-            </w:r>
-          </w:p>
-        </w:tc>
-        <w:tc>
-          <w:tcPr>
-            <w:tcW w:type="dxa" w:w="3216"/>
-            <w:shd w:val="clear" w:fill="F4F4F4"/>
-          </w:tcPr>
-          <w:p>
-            <w:pPr>
-              <w:spacing w:before="40" w:after="40"/>
-            </w:pPr>
-            <w:r/>
-            <w:r>
-              <w:rPr>
-                <w:color w:val="1D1D1D"/>
-                <w:sz w:val="19"/>
-              </w:rPr>
-              <w:t>1</w:t>
-            </w:r>
-          </w:p>
-        </w:tc>
-      </w:tr>
-    </w:tbl>
-    <w:p/>
     <w:p>
       <w:pPr>
         <w:spacing w:after="140"/>
@@ -976,14 +361,7 @@
           <w:color w:val="1D1D1D"/>
           <w:sz w:val="21"/>
         </w:rPr>
-        <w:t>This is the gap.</w:t>
-      </w:r>
-      <w:r>
-        <w:rPr>
-          <w:color w:val="1D1D1D"/>
-          <w:sz w:val="21"/>
-        </w:rPr>
-        <w:t xml:space="preserve"> Under the framework's own rule — any dimension below 3 becomes a Phase 1</w:t>
+        <w:t>This is the gap, and it is the only one.</w:t>
       </w:r>
     </w:p>
     <w:p>
@@ -995,7 +373,7 @@
           <w:color w:val="1D1D1D"/>
           <w:sz w:val="21"/>
         </w:rPr>
-        <w:t>workstream — governance is the single workstream this assessment produces. It is also precisely</w:t>
+        <w:t>*Ownership:* absent. Nothing assigns an owner, steward or accountable party to any entity —</w:t>
       </w:r>
     </w:p>
     <w:p>
@@ -1007,7 +385,22 @@
           <w:color w:val="1D1D1D"/>
           <w:sz w:val="21"/>
         </w:rPr>
-        <w:t>what a data product is: a governed, owned, catalogued, lineage-tracked unit. The framework</w:t>
+        <w:t xml:space="preserve">there is no </w:t>
+      </w:r>
+      <w:r>
+        <w:rPr>
+          <w:rFonts w:ascii="Consolas" w:hAnsi="Consolas"/>
+          <w:color w:val="1D1D1D"/>
+          <w:sz w:val="19"/>
+        </w:rPr>
+        <w:t>CODEOWNERS</w:t>
+      </w:r>
+      <w:r>
+        <w:rPr>
+          <w:color w:val="1D1D1D"/>
+          <w:sz w:val="21"/>
+        </w:rPr>
+        <w:t xml:space="preserve"> file and no ownership annotation anywhere in the model.</w:t>
       </w:r>
     </w:p>
     <w:p>
@@ -1019,7 +412,178 @@
           <w:color w:val="1D1D1D"/>
           <w:sz w:val="21"/>
         </w:rPr>
-        <w:t>applied to us returns the argument for BDC.</w:t>
+        <w:t>*Master data governance:* the article master was enriched by us — unit cost, temperature zone,</w:t>
+      </w:r>
+    </w:p>
+    <w:p>
+      <w:pPr>
+        <w:spacing w:after="140"/>
+      </w:pPr>
+      <w:r>
+        <w:rPr>
+          <w:color w:val="1D1D1D"/>
+          <w:sz w:val="21"/>
+        </w:rPr>
+        <w:t>shelf life, ABC class, RFID flag, reorder point, supplier — under a fixed seed, so the values</w:t>
+      </w:r>
+    </w:p>
+    <w:p>
+      <w:pPr>
+        <w:spacing w:after="140"/>
+      </w:pPr>
+      <w:r>
+        <w:rPr>
+          <w:color w:val="1D1D1D"/>
+          <w:sz w:val="21"/>
+        </w:rPr>
+        <w:t>are reproducible and documented. But there is no source of record, no approval step and no</w:t>
+      </w:r>
+    </w:p>
+    <w:p>
+      <w:pPr>
+        <w:spacing w:after="140"/>
+      </w:pPr>
+      <w:r>
+        <w:rPr>
+          <w:color w:val="1D1D1D"/>
+          <w:sz w:val="21"/>
+        </w:rPr>
+        <w:t>change process. The values are defensible; the process does not exist.</w:t>
+      </w:r>
+    </w:p>
+    <w:p>
+      <w:pPr>
+        <w:spacing w:after="140"/>
+      </w:pPr>
+      <w:r>
+        <w:rPr>
+          <w:color w:val="1D1D1D"/>
+          <w:sz w:val="21"/>
+        </w:rPr>
+        <w:t xml:space="preserve">*Data quality monitoring:* weaker than it first appears. </w:t>
+      </w:r>
+      <w:r>
+        <w:rPr>
+          <w:rFonts w:ascii="Consolas" w:hAnsi="Consolas"/>
+          <w:color w:val="1D1D1D"/>
+          <w:sz w:val="19"/>
+        </w:rPr>
+        <w:t>extract_cashing_up()</w:t>
+      </w:r>
+      <w:r>
+        <w:rPr>
+          <w:color w:val="1D1D1D"/>
+          <w:sz w:val="21"/>
+        </w:rPr>
+        <w:t xml:space="preserve"> reads SAP's own</w:t>
+      </w:r>
+    </w:p>
+    <w:p>
+      <w:pPr>
+        <w:spacing w:after="140"/>
+      </w:pPr>
+      <w:r>
+        <w:rPr>
+          <w:color w:val="1D1D1D"/>
+          <w:sz w:val="21"/>
+        </w:rPr>
+        <w:t>totals into the manifest on every run, but nothing compares them to the extracted rows. There is</w:t>
+      </w:r>
+    </w:p>
+    <w:p>
+      <w:pPr>
+        <w:spacing w:after="140"/>
+      </w:pPr>
+      <w:r>
+        <w:rPr>
+          <w:color w:val="1D1D1D"/>
+          <w:sz w:val="21"/>
+        </w:rPr>
+        <w:t>no assertion and no failure on mismatch — the only hard exits in the pipeline are for a missing</w:t>
+      </w:r>
+    </w:p>
+    <w:p>
+      <w:pPr>
+        <w:spacing w:after="140"/>
+      </w:pPr>
+      <w:r>
+        <w:rPr>
+          <w:color w:val="1D1D1D"/>
+          <w:sz w:val="21"/>
+        </w:rPr>
+        <w:t>dependency and an empty source directory. The reconciliation was verified once, by hand, and the</w:t>
+      </w:r>
+    </w:p>
+    <w:p>
+      <w:pPr>
+        <w:spacing w:after="140"/>
+      </w:pPr>
+      <w:r>
+        <w:rPr>
+          <w:color w:val="1D1D1D"/>
+          <w:sz w:val="21"/>
+        </w:rPr>
+        <w:t>figures are recorded for inspection. A recorded figure is not a control.</w:t>
+      </w:r>
+    </w:p>
+    <w:p>
+      <w:pPr>
+        <w:spacing w:after="140"/>
+      </w:pPr>
+      <w:r>
+        <w:rPr>
+          <w:color w:val="1D1D1D"/>
+          <w:sz w:val="21"/>
+        </w:rPr>
+        <w:t>*Catalogue and lineage:* absent. No catalogue, no glossary, no lineage tooling. Lineage exists</w:t>
+      </w:r>
+    </w:p>
+    <w:p>
+      <w:pPr>
+        <w:spacing w:after="140"/>
+      </w:pPr>
+      <w:r>
+        <w:rPr>
+          <w:color w:val="1D1D1D"/>
+          <w:sz w:val="21"/>
+        </w:rPr>
+        <w:t>only as prose in the project report.</w:t>
+      </w:r>
+    </w:p>
+    <w:p>
+      <w:pPr>
+        <w:spacing w:after="140"/>
+      </w:pPr>
+      <w:r>
+        <w:rPr>
+          <w:color w:val="1D1D1D"/>
+          <w:sz w:val="21"/>
+        </w:rPr>
+        <w:t>This is the workstream the assessment produces, and it is precisely what a data product is: a</w:t>
+      </w:r>
+    </w:p>
+    <w:p>
+      <w:pPr>
+        <w:spacing w:after="140"/>
+      </w:pPr>
+      <w:r>
+        <w:rPr>
+          <w:color w:val="1D1D1D"/>
+          <w:sz w:val="21"/>
+        </w:rPr>
+        <w:t>governed, owned, catalogued, lineage-tracked unit. The framework applied to us returns the</w:t>
+      </w:r>
+    </w:p>
+    <w:p>
+      <w:pPr>
+        <w:spacing w:after="140"/>
+      </w:pPr>
+      <w:r>
+        <w:rPr>
+          <w:color w:val="1D1D1D"/>
+          <w:sz w:val="21"/>
+        </w:rPr>
+        <w:t>argument for BDC.</w:t>
       </w:r>
     </w:p>
     <w:p>
@@ -1032,688 +596,27 @@
           <w:color w:val="1D1D1D"/>
           <w:sz w:val="23"/>
         </w:rPr>
-        <w:t>Dimension 3 — Skills and organisation: **3.3 / 5**</w:t>
+        <w:t>Dimension 3 — Skills and organisation</w:t>
       </w:r>
     </w:p>
-    <w:tbl>
-      <w:tblPr>
-        <w:tblW w:type="auto" w:w="0"/>
-        <w:jc w:val="center"/>
-        <w:tblLook w:firstColumn="1" w:firstRow="1" w:lastColumn="0" w:lastRow="0" w:noHBand="0" w:noVBand="1" w:val="04A0"/>
-        <w:tblBorders>
-          <w:top w:val="single" w:sz="4" w:color="BFBFBF"/>
-          <w:left w:val="single" w:sz="4" w:color="BFBFBF"/>
-          <w:bottom w:val="single" w:sz="4" w:color="BFBFBF"/>
-          <w:right w:val="single" w:sz="4" w:color="BFBFBF"/>
-          <w:insideH w:val="single" w:sz="4" w:color="BFBFBF"/>
-          <w:insideV w:val="single" w:sz="4" w:color="BFBFBF"/>
-        </w:tblBorders>
-      </w:tblPr>
-      <w:tblGrid>
-        <w:gridCol w:w="3216"/>
-        <w:gridCol w:w="3216"/>
-        <w:gridCol w:w="3216"/>
-      </w:tblGrid>
-      <w:tr>
-        <w:tc>
-          <w:tcPr>
-            <w:tcW w:type="dxa" w:w="3216"/>
-            <w:shd w:val="clear" w:fill="454545"/>
-          </w:tcPr>
-          <w:p>
-            <w:pPr>
-              <w:spacing w:before="40" w:after="40"/>
-            </w:pPr>
-            <w:r>
-              <w:rPr>
-                <w:b/>
-                <w:color w:val="FFFFFF"/>
-              </w:rPr>
-            </w:r>
-            <w:r>
-              <w:rPr>
-                <w:b/>
-                <w:color w:val="FFFFFF"/>
-                <w:sz w:val="19"/>
-              </w:rPr>
-              <w:t>Criterion</w:t>
-            </w:r>
-          </w:p>
-        </w:tc>
-        <w:tc>
-          <w:tcPr>
-            <w:tcW w:type="dxa" w:w="3216"/>
-            <w:shd w:val="clear" w:fill="454545"/>
-          </w:tcPr>
-          <w:p>
-            <w:pPr>
-              <w:spacing w:before="40" w:after="40"/>
-            </w:pPr>
-            <w:r>
-              <w:rPr>
-                <w:b/>
-                <w:color w:val="FFFFFF"/>
-              </w:rPr>
-            </w:r>
-            <w:r>
-              <w:rPr>
-                <w:b/>
-                <w:color w:val="FFFFFF"/>
-                <w:sz w:val="19"/>
-              </w:rPr>
-              <w:t>Assessment</w:t>
-            </w:r>
-          </w:p>
-        </w:tc>
-        <w:tc>
-          <w:tcPr>
-            <w:tcW w:type="dxa" w:w="3216"/>
-            <w:shd w:val="clear" w:fill="454545"/>
-          </w:tcPr>
-          <w:p>
-            <w:pPr>
-              <w:spacing w:before="40" w:after="40"/>
-            </w:pPr>
-            <w:r>
-              <w:rPr>
-                <w:b/>
-                <w:color w:val="FFFFFF"/>
-              </w:rPr>
-            </w:r>
-            <w:r>
-              <w:rPr>
-                <w:b/>
-                <w:color w:val="FFFFFF"/>
-                <w:sz w:val="19"/>
-              </w:rPr>
-              <w:t>Score</w:t>
-            </w:r>
-          </w:p>
-        </w:tc>
-      </w:tr>
-      <w:tr>
-        <w:tc>
-          <w:tcPr>
-            <w:tcW w:type="dxa" w:w="3216"/>
-          </w:tcPr>
-          <w:p>
-            <w:pPr>
-              <w:spacing w:before="40" w:after="40"/>
-            </w:pPr>
-            <w:r/>
-            <w:r>
-              <w:rPr>
-                <w:color w:val="1D1D1D"/>
-                <w:sz w:val="19"/>
-              </w:rPr>
-              <w:t>SAP BW / HANA technical skills depth</w:t>
-            </w:r>
-          </w:p>
-        </w:tc>
-        <w:tc>
-          <w:tcPr>
-            <w:tcW w:type="dxa" w:w="3216"/>
-          </w:tcPr>
-          <w:p>
-            <w:pPr>
-              <w:spacing w:before="40" w:after="40"/>
-            </w:pPr>
-            <w:r/>
-            <w:r>
-              <w:rPr>
-                <w:color w:val="1D1D1D"/>
-                <w:sz w:val="19"/>
-              </w:rPr>
-              <w:t>HANA Cloud side is proven — 131 artifacts deployed, 0 warnings, the CDS model compiled to HANA unchanged. BW: none.</w:t>
-            </w:r>
-          </w:p>
-        </w:tc>
-        <w:tc>
-          <w:tcPr>
-            <w:tcW w:type="dxa" w:w="3216"/>
-          </w:tcPr>
-          <w:p>
-            <w:pPr>
-              <w:spacing w:before="40" w:after="40"/>
-            </w:pPr>
-            <w:r/>
-            <w:r>
-              <w:rPr>
-                <w:color w:val="1D1D1D"/>
-                <w:sz w:val="19"/>
-              </w:rPr>
-              <w:t>3</w:t>
-            </w:r>
-          </w:p>
-        </w:tc>
-      </w:tr>
-      <w:tr>
-        <w:tc>
-          <w:tcPr>
-            <w:tcW w:type="dxa" w:w="3216"/>
-            <w:shd w:val="clear" w:fill="F4F4F4"/>
-          </w:tcPr>
-          <w:p>
-            <w:pPr>
-              <w:spacing w:before="40" w:after="40"/>
-            </w:pPr>
-            <w:r/>
-            <w:r>
-              <w:rPr>
-                <w:color w:val="1D1D1D"/>
-                <w:sz w:val="19"/>
-              </w:rPr>
-              <w:t>Cloud analytics skills</w:t>
-            </w:r>
-          </w:p>
-        </w:tc>
-        <w:tc>
-          <w:tcPr>
-            <w:tcW w:type="dxa" w:w="3216"/>
-            <w:shd w:val="clear" w:fill="F4F4F4"/>
-          </w:tcPr>
-          <w:p>
-            <w:pPr>
-              <w:spacing w:before="40" w:after="40"/>
-            </w:pPr>
-            <w:r/>
-            <w:r>
-              <w:rPr>
-                <w:color w:val="1D1D1D"/>
-                <w:sz w:val="19"/>
-              </w:rPr>
-              <w:t>BTP, CAP, CDS, Fiori Elements, XSUAA and the Application Router are all exercised end to end. SAP Analytics Cloud: none.</w:t>
-            </w:r>
-          </w:p>
-        </w:tc>
-        <w:tc>
-          <w:tcPr>
-            <w:tcW w:type="dxa" w:w="3216"/>
-            <w:shd w:val="clear" w:fill="F4F4F4"/>
-          </w:tcPr>
-          <w:p>
-            <w:pPr>
-              <w:spacing w:before="40" w:after="40"/>
-            </w:pPr>
-            <w:r/>
-            <w:r>
-              <w:rPr>
-                <w:color w:val="1D1D1D"/>
-                <w:sz w:val="19"/>
-              </w:rPr>
-              <w:t>3</w:t>
-            </w:r>
-          </w:p>
-        </w:tc>
-      </w:tr>
-      <w:tr>
-        <w:tc>
-          <w:tcPr>
-            <w:tcW w:type="dxa" w:w="3216"/>
-          </w:tcPr>
-          <w:p>
-            <w:pPr>
-              <w:spacing w:before="40" w:after="40"/>
-            </w:pPr>
-            <w:r/>
-            <w:r>
-              <w:rPr>
-                <w:color w:val="1D1D1D"/>
-                <w:sz w:val="19"/>
-              </w:rPr>
-              <w:t>Data engineering capability</w:t>
-            </w:r>
-          </w:p>
-        </w:tc>
-        <w:tc>
-          <w:tcPr>
-            <w:tcW w:type="dxa" w:w="3216"/>
-          </w:tcPr>
-          <w:p>
-            <w:pPr>
-              <w:spacing w:before="40" w:after="40"/>
-            </w:pPr>
-            <w:r/>
-            <w:r>
-              <w:rPr>
-                <w:color w:val="1D1D1D"/>
-                <w:sz w:val="19"/>
-              </w:rPr>
-              <w:t>An ETL pipeline that handles report-shaped exports properly — metadata rows above the header, group keys printed once per block, total rows mixed in with real ones, and a primary source chosen by row count rather than filename.</w:t>
-            </w:r>
-          </w:p>
-        </w:tc>
-        <w:tc>
-          <w:tcPr>
-            <w:tcW w:type="dxa" w:w="3216"/>
-          </w:tcPr>
-          <w:p>
-            <w:pPr>
-              <w:spacing w:before="40" w:after="40"/>
-            </w:pPr>
-            <w:r/>
-            <w:r>
-              <w:rPr>
-                <w:color w:val="1D1D1D"/>
-                <w:sz w:val="19"/>
-              </w:rPr>
-              <w:t>4</w:t>
-            </w:r>
-          </w:p>
-        </w:tc>
-      </w:tr>
-      <w:tr>
-        <w:tc>
-          <w:tcPr>
-            <w:tcW w:type="dxa" w:w="3216"/>
-            <w:shd w:val="clear" w:fill="F4F4F4"/>
-          </w:tcPr>
-          <w:p>
-            <w:pPr>
-              <w:spacing w:before="40" w:after="40"/>
-            </w:pPr>
-            <w:r/>
-            <w:r>
-              <w:rPr>
-                <w:color w:val="1D1D1D"/>
-                <w:sz w:val="19"/>
-              </w:rPr>
-              <w:t>Change management readiness</w:t>
-            </w:r>
-          </w:p>
-        </w:tc>
-        <w:tc>
-          <w:tcPr>
-            <w:tcW w:type="dxa" w:w="3216"/>
-            <w:shd w:val="clear" w:fill="F4F4F4"/>
-          </w:tcPr>
-          <w:p>
-            <w:pPr>
-              <w:spacing w:before="40" w:after="40"/>
-            </w:pPr>
-            <w:r/>
-            <w:r>
-              <w:rPr>
-                <w:color w:val="1D1D1D"/>
-                <w:sz w:val="19"/>
-              </w:rPr>
-              <w:t>Not applicable to a demo team.</w:t>
-            </w:r>
-          </w:p>
-        </w:tc>
-        <w:tc>
-          <w:tcPr>
-            <w:tcW w:type="dxa" w:w="3216"/>
-            <w:shd w:val="clear" w:fill="F4F4F4"/>
-          </w:tcPr>
-          <w:p>
-            <w:pPr>
-              <w:spacing w:before="40" w:after="40"/>
-            </w:pPr>
-            <w:r/>
-            <w:r>
-              <w:rPr>
-                <w:color w:val="1D1D1D"/>
-                <w:sz w:val="19"/>
-              </w:rPr>
-              <w:t>N/A</w:t>
-            </w:r>
-          </w:p>
-        </w:tc>
-      </w:tr>
-    </w:tbl>
-    <w:p/>
-    <w:p>
-      <w:pPr>
-        <w:pStyle w:val="Heading3"/>
-      </w:pPr>
-      <w:r>
-        <w:rPr>
-          <w:b/>
-          <w:color w:val="1D1D1D"/>
-          <w:sz w:val="23"/>
-        </w:rPr>
-        <w:t>Dimension 4 — Business use case clarity: **4.2 / 5**</w:t>
-      </w:r>
-    </w:p>
-    <w:tbl>
-      <w:tblPr>
-        <w:tblW w:type="auto" w:w="0"/>
-        <w:jc w:val="center"/>
-        <w:tblLook w:firstColumn="1" w:firstRow="1" w:lastColumn="0" w:lastRow="0" w:noHBand="0" w:noVBand="1" w:val="04A0"/>
-        <w:tblBorders>
-          <w:top w:val="single" w:sz="4" w:color="BFBFBF"/>
-          <w:left w:val="single" w:sz="4" w:color="BFBFBF"/>
-          <w:bottom w:val="single" w:sz="4" w:color="BFBFBF"/>
-          <w:right w:val="single" w:sz="4" w:color="BFBFBF"/>
-          <w:insideH w:val="single" w:sz="4" w:color="BFBFBF"/>
-          <w:insideV w:val="single" w:sz="4" w:color="BFBFBF"/>
-        </w:tblBorders>
-      </w:tblPr>
-      <w:tblGrid>
-        <w:gridCol w:w="3216"/>
-        <w:gridCol w:w="3216"/>
-        <w:gridCol w:w="3216"/>
-      </w:tblGrid>
-      <w:tr>
-        <w:tc>
-          <w:tcPr>
-            <w:tcW w:type="dxa" w:w="3216"/>
-            <w:shd w:val="clear" w:fill="454545"/>
-          </w:tcPr>
-          <w:p>
-            <w:pPr>
-              <w:spacing w:before="40" w:after="40"/>
-            </w:pPr>
-            <w:r>
-              <w:rPr>
-                <w:b/>
-                <w:color w:val="FFFFFF"/>
-              </w:rPr>
-            </w:r>
-            <w:r>
-              <w:rPr>
-                <w:b/>
-                <w:color w:val="FFFFFF"/>
-                <w:sz w:val="19"/>
-              </w:rPr>
-              <w:t>Criterion</w:t>
-            </w:r>
-          </w:p>
-        </w:tc>
-        <w:tc>
-          <w:tcPr>
-            <w:tcW w:type="dxa" w:w="3216"/>
-            <w:shd w:val="clear" w:fill="454545"/>
-          </w:tcPr>
-          <w:p>
-            <w:pPr>
-              <w:spacing w:before="40" w:after="40"/>
-            </w:pPr>
-            <w:r>
-              <w:rPr>
-                <w:b/>
-                <w:color w:val="FFFFFF"/>
-              </w:rPr>
-            </w:r>
-            <w:r>
-              <w:rPr>
-                <w:b/>
-                <w:color w:val="FFFFFF"/>
-                <w:sz w:val="19"/>
-              </w:rPr>
-              <w:t>Assessment</w:t>
-            </w:r>
-          </w:p>
-        </w:tc>
-        <w:tc>
-          <w:tcPr>
-            <w:tcW w:type="dxa" w:w="3216"/>
-            <w:shd w:val="clear" w:fill="454545"/>
-          </w:tcPr>
-          <w:p>
-            <w:pPr>
-              <w:spacing w:before="40" w:after="40"/>
-            </w:pPr>
-            <w:r>
-              <w:rPr>
-                <w:b/>
-                <w:color w:val="FFFFFF"/>
-              </w:rPr>
-            </w:r>
-            <w:r>
-              <w:rPr>
-                <w:b/>
-                <w:color w:val="FFFFFF"/>
-                <w:sz w:val="19"/>
-              </w:rPr>
-              <w:t>Score</w:t>
-            </w:r>
-          </w:p>
-        </w:tc>
-      </w:tr>
-      <w:tr>
-        <w:tc>
-          <w:tcPr>
-            <w:tcW w:type="dxa" w:w="3216"/>
-          </w:tcPr>
-          <w:p>
-            <w:pPr>
-              <w:spacing w:before="40" w:after="40"/>
-            </w:pPr>
-            <w:r/>
-            <w:r>
-              <w:rPr>
-                <w:color w:val="1D1D1D"/>
-                <w:sz w:val="19"/>
-              </w:rPr>
-              <w:t>Prioritised analytics use case backlog</w:t>
-            </w:r>
-          </w:p>
-        </w:tc>
-        <w:tc>
-          <w:tcPr>
-            <w:tcW w:type="dxa" w:w="3216"/>
-          </w:tcPr>
-          <w:p>
-            <w:pPr>
-              <w:spacing w:before="40" w:after="40"/>
-            </w:pPr>
-            <w:r/>
-            <w:r>
-              <w:rPr>
-                <w:color w:val="1D1D1D"/>
-                <w:sz w:val="19"/>
-              </w:rPr>
-              <w:t>Seven scenarios built and running, each ranked by euros at stake weighted by model confidence. The prioritisation is not a slide; it is a live query.</w:t>
-            </w:r>
-          </w:p>
-        </w:tc>
-        <w:tc>
-          <w:tcPr>
-            <w:tcW w:type="dxa" w:w="3216"/>
-          </w:tcPr>
-          <w:p>
-            <w:pPr>
-              <w:spacing w:before="40" w:after="40"/>
-            </w:pPr>
-            <w:r/>
-            <w:r>
-              <w:rPr>
-                <w:color w:val="1D1D1D"/>
-                <w:sz w:val="19"/>
-              </w:rPr>
-              <w:t>5</w:t>
-            </w:r>
-          </w:p>
-        </w:tc>
-      </w:tr>
-      <w:tr>
-        <w:tc>
-          <w:tcPr>
-            <w:tcW w:type="dxa" w:w="3216"/>
-            <w:shd w:val="clear" w:fill="F4F4F4"/>
-          </w:tcPr>
-          <w:p>
-            <w:pPr>
-              <w:spacing w:before="40" w:after="40"/>
-            </w:pPr>
-            <w:r/>
-            <w:r>
-              <w:rPr>
-                <w:color w:val="1D1D1D"/>
-                <w:sz w:val="19"/>
-              </w:rPr>
-              <w:t>Business sponsor engagement</w:t>
-            </w:r>
-          </w:p>
-        </w:tc>
-        <w:tc>
-          <w:tcPr>
-            <w:tcW w:type="dxa" w:w="3216"/>
-            <w:shd w:val="clear" w:fill="F4F4F4"/>
-          </w:tcPr>
-          <w:p>
-            <w:pPr>
-              <w:spacing w:before="40" w:after="40"/>
-            </w:pPr>
-            <w:r/>
-            <w:r>
-              <w:rPr>
-                <w:color w:val="1D1D1D"/>
-                <w:sz w:val="19"/>
-              </w:rPr>
-              <w:t>Active and specific.</w:t>
-            </w:r>
-          </w:p>
-        </w:tc>
-        <w:tc>
-          <w:tcPr>
-            <w:tcW w:type="dxa" w:w="3216"/>
-            <w:shd w:val="clear" w:fill="F4F4F4"/>
-          </w:tcPr>
-          <w:p>
-            <w:pPr>
-              <w:spacing w:before="40" w:after="40"/>
-            </w:pPr>
-            <w:r/>
-            <w:r>
-              <w:rPr>
-                <w:color w:val="1D1D1D"/>
-                <w:sz w:val="19"/>
-              </w:rPr>
-              <w:t>4</w:t>
-            </w:r>
-          </w:p>
-        </w:tc>
-      </w:tr>
-      <w:tr>
-        <w:tc>
-          <w:tcPr>
-            <w:tcW w:type="dxa" w:w="3216"/>
-          </w:tcPr>
-          <w:p>
-            <w:pPr>
-              <w:spacing w:before="40" w:after="40"/>
-            </w:pPr>
-            <w:r/>
-            <w:r>
-              <w:rPr>
-                <w:color w:val="1D1D1D"/>
-                <w:sz w:val="19"/>
-              </w:rPr>
-              <w:t>Value metrics agreed for target state</w:t>
-            </w:r>
-          </w:p>
-        </w:tc>
-        <w:tc>
-          <w:tcPr>
-            <w:tcW w:type="dxa" w:w="3216"/>
-          </w:tcPr>
-          <w:p>
-            <w:pPr>
-              <w:spacing w:before="40" w:after="40"/>
-            </w:pPr>
-            <w:r/>
-            <w:r>
-              <w:rPr>
-                <w:color w:val="1D1D1D"/>
-                <w:sz w:val="19"/>
-              </w:rPr>
-              <w:t>Partially. Value at stake, skill against a seasonal-naive benchmark and signed bias are all measured. What is not agreed is the target — no threshold has been set that would say the system is performing.</w:t>
-            </w:r>
-          </w:p>
-        </w:tc>
-        <w:tc>
-          <w:tcPr>
-            <w:tcW w:type="dxa" w:w="3216"/>
-          </w:tcPr>
-          <w:p>
-            <w:pPr>
-              <w:spacing w:before="40" w:after="40"/>
-            </w:pPr>
-            <w:r/>
-            <w:r>
-              <w:rPr>
-                <w:color w:val="1D1D1D"/>
-                <w:sz w:val="19"/>
-              </w:rPr>
-              <w:t>3</w:t>
-            </w:r>
-          </w:p>
-        </w:tc>
-      </w:tr>
-      <w:tr>
-        <w:tc>
-          <w:tcPr>
-            <w:tcW w:type="dxa" w:w="3216"/>
-            <w:shd w:val="clear" w:fill="F4F4F4"/>
-          </w:tcPr>
-          <w:p>
-            <w:pPr>
-              <w:spacing w:before="40" w:after="40"/>
-            </w:pPr>
-            <w:r/>
-            <w:r>
-              <w:rPr>
-                <w:color w:val="1D1D1D"/>
-                <w:sz w:val="19"/>
-              </w:rPr>
-              <w:t>AI/ML use cases identified</w:t>
-            </w:r>
-          </w:p>
-        </w:tc>
-        <w:tc>
-          <w:tcPr>
-            <w:tcW w:type="dxa" w:w="3216"/>
-            <w:shd w:val="clear" w:fill="F4F4F4"/>
-          </w:tcPr>
-          <w:p>
-            <w:pPr>
-              <w:spacing w:before="40" w:after="40"/>
-            </w:pPr>
-            <w:r/>
-            <w:r>
-              <w:rPr>
-                <w:color w:val="1D1D1D"/>
-                <w:sz w:val="19"/>
-              </w:rPr>
-              <w:t>Seven identified and implemented, not merely listed.</w:t>
-            </w:r>
-          </w:p>
-        </w:tc>
-        <w:tc>
-          <w:tcPr>
-            <w:tcW w:type="dxa" w:w="3216"/>
-            <w:shd w:val="clear" w:fill="F4F4F4"/>
-          </w:tcPr>
-          <w:p>
-            <w:pPr>
-              <w:spacing w:before="40" w:after="40"/>
-            </w:pPr>
-            <w:r/>
-            <w:r>
-              <w:rPr>
-                <w:color w:val="1D1D1D"/>
-                <w:sz w:val="19"/>
-              </w:rPr>
-              <w:t>5</w:t>
-            </w:r>
-          </w:p>
-        </w:tc>
-      </w:tr>
-    </w:tbl>
-    <w:p/>
     <w:p>
       <w:pPr>
         <w:spacing w:after="140"/>
       </w:pPr>
       <w:r>
         <w:rPr>
+          <w:b/>
           <w:color w:val="1D1D1D"/>
           <w:sz w:val="21"/>
         </w:rPr>
-        <w:t>The strongest dimension, and the reason the BDC conversation is worth having at all: the use</w:t>
+        <w:t>Adequate on the platform, absent on the analytics stack.</w:t>
+      </w:r>
+      <w:r>
+        <w:rPr>
+          <w:color w:val="1D1D1D"/>
+          <w:sz w:val="21"/>
+        </w:rPr>
+        <w:t xml:space="preserve"> The HANA Cloud side is proven —</w:t>
       </w:r>
     </w:p>
     <w:p>
@@ -1725,7 +628,67 @@
           <w:color w:val="1D1D1D"/>
           <w:sz w:val="21"/>
         </w:rPr>
-        <w:t>cases already exist and run. What is missing sits underneath them.</w:t>
+        <w:t>131 artifacts deployed with 0 warnings, and the CDS model compiled to HANA unchanged. BTP, CAP,</w:t>
+      </w:r>
+    </w:p>
+    <w:p>
+      <w:pPr>
+        <w:spacing w:after="140"/>
+      </w:pPr>
+      <w:r>
+        <w:rPr>
+          <w:color w:val="1D1D1D"/>
+          <w:sz w:val="21"/>
+        </w:rPr>
+        <w:t>CDS, Fiori Elements, XSUAA and the Application Router are all exercised end to end.</w:t>
+      </w:r>
+    </w:p>
+    <w:p>
+      <w:pPr>
+        <w:spacing w:after="140"/>
+      </w:pPr>
+      <w:r>
+        <w:rPr>
+          <w:color w:val="1D1D1D"/>
+          <w:sz w:val="21"/>
+        </w:rPr>
+        <w:t>BW and SAP Analytics Cloud are both at zero. Data engineering is the strongest part: the ETL</w:t>
+      </w:r>
+    </w:p>
+    <w:p>
+      <w:pPr>
+        <w:spacing w:after="140"/>
+      </w:pPr>
+      <w:r>
+        <w:rPr>
+          <w:color w:val="1D1D1D"/>
+          <w:sz w:val="21"/>
+        </w:rPr>
+        <w:t>handles report-shaped exports properly — metadata rows above the header, group keys printed once</w:t>
+      </w:r>
+    </w:p>
+    <w:p>
+      <w:pPr>
+        <w:spacing w:after="140"/>
+      </w:pPr>
+      <w:r>
+        <w:rPr>
+          <w:color w:val="1D1D1D"/>
+          <w:sz w:val="21"/>
+        </w:rPr>
+        <w:t>per block, total rows mixed in with the real ones — rather than assuming a tidy table.</w:t>
+      </w:r>
+    </w:p>
+    <w:p>
+      <w:pPr>
+        <w:spacing w:after="140"/>
+      </w:pPr>
+      <w:r>
+        <w:rPr>
+          <w:color w:val="1D1D1D"/>
+          <w:sz w:val="21"/>
+        </w:rPr>
+        <w:t>Change management readiness does not apply to a demo team.</w:t>
       </w:r>
     </w:p>
     <w:p>
@@ -1738,745 +701,27 @@
           <w:color w:val="1D1D1D"/>
           <w:sz w:val="23"/>
         </w:rPr>
-        <w:t>Dimension 5 — Technical infrastructure: **3.0 / 5**</w:t>
+        <w:t>Dimension 4 — Business use case clarity</w:t>
       </w:r>
     </w:p>
-    <w:tbl>
-      <w:tblPr>
-        <w:tblW w:type="auto" w:w="0"/>
-        <w:jc w:val="center"/>
-        <w:tblLook w:firstColumn="1" w:firstRow="1" w:lastColumn="0" w:lastRow="0" w:noHBand="0" w:noVBand="1" w:val="04A0"/>
-        <w:tblBorders>
-          <w:top w:val="single" w:sz="4" w:color="BFBFBF"/>
-          <w:left w:val="single" w:sz="4" w:color="BFBFBF"/>
-          <w:bottom w:val="single" w:sz="4" w:color="BFBFBF"/>
-          <w:right w:val="single" w:sz="4" w:color="BFBFBF"/>
-          <w:insideH w:val="single" w:sz="4" w:color="BFBFBF"/>
-          <w:insideV w:val="single" w:sz="4" w:color="BFBFBF"/>
-        </w:tblBorders>
-      </w:tblPr>
-      <w:tblGrid>
-        <w:gridCol w:w="3216"/>
-        <w:gridCol w:w="3216"/>
-        <w:gridCol w:w="3216"/>
-      </w:tblGrid>
-      <w:tr>
-        <w:tc>
-          <w:tcPr>
-            <w:tcW w:type="dxa" w:w="3216"/>
-            <w:shd w:val="clear" w:fill="454545"/>
-          </w:tcPr>
-          <w:p>
-            <w:pPr>
-              <w:spacing w:before="40" w:after="40"/>
-            </w:pPr>
-            <w:r>
-              <w:rPr>
-                <w:b/>
-                <w:color w:val="FFFFFF"/>
-              </w:rPr>
-            </w:r>
-            <w:r>
-              <w:rPr>
-                <w:b/>
-                <w:color w:val="FFFFFF"/>
-                <w:sz w:val="19"/>
-              </w:rPr>
-              <w:t>Criterion</w:t>
-            </w:r>
-          </w:p>
-        </w:tc>
-        <w:tc>
-          <w:tcPr>
-            <w:tcW w:type="dxa" w:w="3216"/>
-            <w:shd w:val="clear" w:fill="454545"/>
-          </w:tcPr>
-          <w:p>
-            <w:pPr>
-              <w:spacing w:before="40" w:after="40"/>
-            </w:pPr>
-            <w:r>
-              <w:rPr>
-                <w:b/>
-                <w:color w:val="FFFFFF"/>
-              </w:rPr>
-            </w:r>
-            <w:r>
-              <w:rPr>
-                <w:b/>
-                <w:color w:val="FFFFFF"/>
-                <w:sz w:val="19"/>
-              </w:rPr>
-              <w:t>Assessment</w:t>
-            </w:r>
-          </w:p>
-        </w:tc>
-        <w:tc>
-          <w:tcPr>
-            <w:tcW w:type="dxa" w:w="3216"/>
-            <w:shd w:val="clear" w:fill="454545"/>
-          </w:tcPr>
-          <w:p>
-            <w:pPr>
-              <w:spacing w:before="40" w:after="40"/>
-            </w:pPr>
-            <w:r>
-              <w:rPr>
-                <w:b/>
-                <w:color w:val="FFFFFF"/>
-              </w:rPr>
-            </w:r>
-            <w:r>
-              <w:rPr>
-                <w:b/>
-                <w:color w:val="FFFFFF"/>
-                <w:sz w:val="19"/>
-              </w:rPr>
-              <w:t>Score</w:t>
-            </w:r>
-          </w:p>
-        </w:tc>
-      </w:tr>
-      <w:tr>
-        <w:tc>
-          <w:tcPr>
-            <w:tcW w:type="dxa" w:w="3216"/>
-          </w:tcPr>
-          <w:p>
-            <w:pPr>
-              <w:spacing w:before="40" w:after="40"/>
-            </w:pPr>
-            <w:r/>
-            <w:r>
-              <w:rPr>
-                <w:color w:val="1D1D1D"/>
-                <w:sz w:val="19"/>
-              </w:rPr>
-              <w:t>BTP account and landscape setup</w:t>
-            </w:r>
-          </w:p>
-        </w:tc>
-        <w:tc>
-          <w:tcPr>
-            <w:tcW w:type="dxa" w:w="3216"/>
-          </w:tcPr>
-          <w:p>
-            <w:pPr>
-              <w:spacing w:before="40" w:after="40"/>
-            </w:pPr>
-            <w:r/>
-            <w:r>
-              <w:rPr>
-                <w:color w:val="1D1D1D"/>
-                <w:sz w:val="19"/>
-              </w:rPr>
-              <w:t>Complete. Cloud Foundry org and space, HANA Cloud instance, HDI container, MTA deployment.</w:t>
-            </w:r>
-          </w:p>
-        </w:tc>
-        <w:tc>
-          <w:tcPr>
-            <w:tcW w:type="dxa" w:w="3216"/>
-          </w:tcPr>
-          <w:p>
-            <w:pPr>
-              <w:spacing w:before="40" w:after="40"/>
-            </w:pPr>
-            <w:r/>
-            <w:r>
-              <w:rPr>
-                <w:color w:val="1D1D1D"/>
-                <w:sz w:val="19"/>
-              </w:rPr>
-              <w:t>5</w:t>
-            </w:r>
-          </w:p>
-        </w:tc>
-      </w:tr>
-      <w:tr>
-        <w:tc>
-          <w:tcPr>
-            <w:tcW w:type="dxa" w:w="3216"/>
-            <w:shd w:val="clear" w:fill="F4F4F4"/>
-          </w:tcPr>
-          <w:p>
-            <w:pPr>
-              <w:spacing w:before="40" w:after="40"/>
-            </w:pPr>
-            <w:r/>
-            <w:r>
-              <w:rPr>
-                <w:color w:val="1D1D1D"/>
-                <w:sz w:val="19"/>
-              </w:rPr>
-              <w:t>Network and security architecture</w:t>
-            </w:r>
-          </w:p>
-        </w:tc>
-        <w:tc>
-          <w:tcPr>
-            <w:tcW w:type="dxa" w:w="3216"/>
-            <w:shd w:val="clear" w:fill="F4F4F4"/>
-          </w:tcPr>
-          <w:p>
-            <w:pPr>
-              <w:spacing w:before="40" w:after="40"/>
-            </w:pPr>
-            <w:r/>
-            <w:r>
-              <w:rPr>
-                <w:color w:val="1D1D1D"/>
-                <w:sz w:val="19"/>
-              </w:rPr>
-              <w:t>XSUAA with three role templates and three role collections, Application Router fronting both services, destinations with token forwarding.</w:t>
-            </w:r>
-          </w:p>
-        </w:tc>
-        <w:tc>
-          <w:tcPr>
-            <w:tcW w:type="dxa" w:w="3216"/>
-            <w:shd w:val="clear" w:fill="F4F4F4"/>
-          </w:tcPr>
-          <w:p>
-            <w:pPr>
-              <w:spacing w:before="40" w:after="40"/>
-            </w:pPr>
-            <w:r/>
-            <w:r>
-              <w:rPr>
-                <w:color w:val="1D1D1D"/>
-                <w:sz w:val="19"/>
-              </w:rPr>
-              <w:t>4</w:t>
-            </w:r>
-          </w:p>
-        </w:tc>
-      </w:tr>
-      <w:tr>
-        <w:tc>
-          <w:tcPr>
-            <w:tcW w:type="dxa" w:w="3216"/>
-          </w:tcPr>
-          <w:p>
-            <w:pPr>
-              <w:spacing w:before="40" w:after="40"/>
-            </w:pPr>
-            <w:r/>
-            <w:r>
-              <w:rPr>
-                <w:color w:val="1D1D1D"/>
-                <w:sz w:val="19"/>
-              </w:rPr>
-              <w:t>Integration platform health</w:t>
-            </w:r>
-          </w:p>
-        </w:tc>
-        <w:tc>
-          <w:tcPr>
-            <w:tcW w:type="dxa" w:w="3216"/>
-          </w:tcPr>
-          <w:p>
-            <w:pPr>
-              <w:spacing w:before="40" w:after="40"/>
-            </w:pPr>
-            <w:r/>
-            <w:r>
-              <w:rPr>
-                <w:color w:val="1D1D1D"/>
-                <w:sz w:val="19"/>
-              </w:rPr>
-              <w:t>No CPI or Integration Suite in the picture. Every integration is file-based or direct.</w:t>
-            </w:r>
-          </w:p>
-        </w:tc>
-        <w:tc>
-          <w:tcPr>
-            <w:tcW w:type="dxa" w:w="3216"/>
-          </w:tcPr>
-          <w:p>
-            <w:pPr>
-              <w:spacing w:before="40" w:after="40"/>
-            </w:pPr>
-            <w:r/>
-            <w:r>
-              <w:rPr>
-                <w:color w:val="1D1D1D"/>
-                <w:sz w:val="19"/>
-              </w:rPr>
-              <w:t>1</w:t>
-            </w:r>
-          </w:p>
-        </w:tc>
-      </w:tr>
-      <w:tr>
-        <w:tc>
-          <w:tcPr>
-            <w:tcW w:type="dxa" w:w="3216"/>
-            <w:shd w:val="clear" w:fill="F4F4F4"/>
-          </w:tcPr>
-          <w:p>
-            <w:pPr>
-              <w:spacing w:before="40" w:after="40"/>
-            </w:pPr>
-            <w:r/>
-            <w:r>
-              <w:rPr>
-                <w:color w:val="1D1D1D"/>
-                <w:sz w:val="19"/>
-              </w:rPr>
-              <w:t>Licence entitlements and contracts</w:t>
-            </w:r>
-          </w:p>
-        </w:tc>
-        <w:tc>
-          <w:tcPr>
-            <w:tcW w:type="dxa" w:w="3216"/>
-            <w:shd w:val="clear" w:fill="F4F4F4"/>
-          </w:tcPr>
-          <w:p>
-            <w:pPr>
-              <w:spacing w:before="40" w:after="40"/>
-            </w:pPr>
-            <w:r/>
-            <w:r>
-              <w:rPr>
-                <w:color w:val="1D1D1D"/>
-                <w:sz w:val="19"/>
-              </w:rPr>
-              <w:t>HANA Cloud entitlement in place. No BDC entitlement.</w:t>
-            </w:r>
-          </w:p>
-        </w:tc>
-        <w:tc>
-          <w:tcPr>
-            <w:tcW w:type="dxa" w:w="3216"/>
-            <w:shd w:val="clear" w:fill="F4F4F4"/>
-          </w:tcPr>
-          <w:p>
-            <w:pPr>
-              <w:spacing w:before="40" w:after="40"/>
-            </w:pPr>
-            <w:r/>
-            <w:r>
-              <w:rPr>
-                <w:color w:val="1D1D1D"/>
-                <w:sz w:val="19"/>
-              </w:rPr>
-              <w:t>2</w:t>
-            </w:r>
-          </w:p>
-        </w:tc>
-      </w:tr>
-    </w:tbl>
-    <w:p/>
-    <w:p>
-      <w:pPr>
-        <w:pStyle w:val="Heading3"/>
-      </w:pPr>
-      <w:r>
-        <w:rPr>
-          <w:b/>
-          <w:color w:val="1D1D1D"/>
-          <w:sz w:val="23"/>
-        </w:rPr>
-        <w:t>Summary</w:t>
-      </w:r>
-    </w:p>
-    <w:tbl>
-      <w:tblPr>
-        <w:tblW w:type="auto" w:w="0"/>
-        <w:jc w:val="center"/>
-        <w:tblLook w:firstColumn="1" w:firstRow="1" w:lastColumn="0" w:lastRow="0" w:noHBand="0" w:noVBand="1" w:val="04A0"/>
-        <w:tblBorders>
-          <w:top w:val="single" w:sz="4" w:color="BFBFBF"/>
-          <w:left w:val="single" w:sz="4" w:color="BFBFBF"/>
-          <w:bottom w:val="single" w:sz="4" w:color="BFBFBF"/>
-          <w:right w:val="single" w:sz="4" w:color="BFBFBF"/>
-          <w:insideH w:val="single" w:sz="4" w:color="BFBFBF"/>
-          <w:insideV w:val="single" w:sz="4" w:color="BFBFBF"/>
-        </w:tblBorders>
-      </w:tblPr>
-      <w:tblGrid>
-        <w:gridCol w:w="3216"/>
-        <w:gridCol w:w="3216"/>
-        <w:gridCol w:w="3216"/>
-      </w:tblGrid>
-      <w:tr>
-        <w:tc>
-          <w:tcPr>
-            <w:tcW w:type="dxa" w:w="3216"/>
-            <w:shd w:val="clear" w:fill="454545"/>
-          </w:tcPr>
-          <w:p>
-            <w:pPr>
-              <w:spacing w:before="40" w:after="40"/>
-            </w:pPr>
-            <w:r>
-              <w:rPr>
-                <w:b/>
-                <w:color w:val="FFFFFF"/>
-              </w:rPr>
-            </w:r>
-            <w:r>
-              <w:rPr>
-                <w:b/>
-                <w:color w:val="FFFFFF"/>
-                <w:sz w:val="19"/>
-              </w:rPr>
-              <w:t>#</w:t>
-            </w:r>
-          </w:p>
-        </w:tc>
-        <w:tc>
-          <w:tcPr>
-            <w:tcW w:type="dxa" w:w="3216"/>
-            <w:shd w:val="clear" w:fill="454545"/>
-          </w:tcPr>
-          <w:p>
-            <w:pPr>
-              <w:spacing w:before="40" w:after="40"/>
-            </w:pPr>
-            <w:r>
-              <w:rPr>
-                <w:b/>
-                <w:color w:val="FFFFFF"/>
-              </w:rPr>
-            </w:r>
-            <w:r>
-              <w:rPr>
-                <w:b/>
-                <w:color w:val="FFFFFF"/>
-                <w:sz w:val="19"/>
-              </w:rPr>
-              <w:t>Dimension</w:t>
-            </w:r>
-          </w:p>
-        </w:tc>
-        <w:tc>
-          <w:tcPr>
-            <w:tcW w:type="dxa" w:w="3216"/>
-            <w:shd w:val="clear" w:fill="454545"/>
-          </w:tcPr>
-          <w:p>
-            <w:pPr>
-              <w:spacing w:before="40" w:after="40"/>
-            </w:pPr>
-            <w:r>
-              <w:rPr>
-                <w:b/>
-                <w:color w:val="FFFFFF"/>
-              </w:rPr>
-            </w:r>
-            <w:r>
-              <w:rPr>
-                <w:b/>
-                <w:color w:val="FFFFFF"/>
-                <w:sz w:val="19"/>
-              </w:rPr>
-              <w:t>Score</w:t>
-            </w:r>
-          </w:p>
-        </w:tc>
-      </w:tr>
-      <w:tr>
-        <w:tc>
-          <w:tcPr>
-            <w:tcW w:type="dxa" w:w="3216"/>
-          </w:tcPr>
-          <w:p>
-            <w:pPr>
-              <w:spacing w:before="40" w:after="40"/>
-            </w:pPr>
-            <w:r/>
-            <w:r>
-              <w:rPr>
-                <w:color w:val="1D1D1D"/>
-                <w:sz w:val="19"/>
-              </w:rPr>
-              <w:t>1</w:t>
-            </w:r>
-          </w:p>
-        </w:tc>
-        <w:tc>
-          <w:tcPr>
-            <w:tcW w:type="dxa" w:w="3216"/>
-          </w:tcPr>
-          <w:p>
-            <w:pPr>
-              <w:spacing w:before="40" w:after="40"/>
-            </w:pPr>
-            <w:r/>
-            <w:r>
-              <w:rPr>
-                <w:color w:val="1D1D1D"/>
-                <w:sz w:val="19"/>
-              </w:rPr>
-              <w:t>Data architecture readiness</w:t>
-            </w:r>
-          </w:p>
-        </w:tc>
-        <w:tc>
-          <w:tcPr>
-            <w:tcW w:type="dxa" w:w="3216"/>
-          </w:tcPr>
-          <w:p>
-            <w:pPr>
-              <w:spacing w:before="40" w:after="40"/>
-            </w:pPr>
-            <w:r/>
-            <w:r>
-              <w:rPr>
-                <w:color w:val="1D1D1D"/>
-                <w:sz w:val="19"/>
-              </w:rPr>
-              <w:t>3.5 / 5</w:t>
-            </w:r>
-          </w:p>
-        </w:tc>
-      </w:tr>
-      <w:tr>
-        <w:tc>
-          <w:tcPr>
-            <w:tcW w:type="dxa" w:w="3216"/>
-            <w:shd w:val="clear" w:fill="F4F4F4"/>
-          </w:tcPr>
-          <w:p>
-            <w:pPr>
-              <w:spacing w:before="40" w:after="40"/>
-            </w:pPr>
-            <w:r/>
-            <w:r>
-              <w:rPr>
-                <w:color w:val="1D1D1D"/>
-                <w:sz w:val="19"/>
-              </w:rPr>
-              <w:t>2</w:t>
-            </w:r>
-          </w:p>
-        </w:tc>
-        <w:tc>
-          <w:tcPr>
-            <w:tcW w:type="dxa" w:w="3216"/>
-            <w:shd w:val="clear" w:fill="F4F4F4"/>
-          </w:tcPr>
-          <w:p>
-            <w:pPr>
-              <w:spacing w:before="40" w:after="40"/>
-            </w:pPr>
-            <w:r/>
-            <w:r>
-              <w:rPr>
-                <w:color w:val="1D1D1D"/>
-                <w:sz w:val="19"/>
-              </w:rPr>
-              <w:t>Data governance and quality</w:t>
-            </w:r>
-          </w:p>
-        </w:tc>
-        <w:tc>
-          <w:tcPr>
-            <w:tcW w:type="dxa" w:w="3216"/>
-            <w:shd w:val="clear" w:fill="F4F4F4"/>
-          </w:tcPr>
-          <w:p>
-            <w:pPr>
-              <w:spacing w:before="40" w:after="40"/>
-            </w:pPr>
-            <w:r/>
-            <w:r>
-              <w:rPr>
-                <w:b/>
-                <w:color w:val="1D1D1D"/>
-                <w:sz w:val="19"/>
-              </w:rPr>
-              <w:t>1.5 / 5</w:t>
-            </w:r>
-          </w:p>
-        </w:tc>
-      </w:tr>
-      <w:tr>
-        <w:tc>
-          <w:tcPr>
-            <w:tcW w:type="dxa" w:w="3216"/>
-          </w:tcPr>
-          <w:p>
-            <w:pPr>
-              <w:spacing w:before="40" w:after="40"/>
-            </w:pPr>
-            <w:r/>
-            <w:r>
-              <w:rPr>
-                <w:color w:val="1D1D1D"/>
-                <w:sz w:val="19"/>
-              </w:rPr>
-              <w:t>3</w:t>
-            </w:r>
-          </w:p>
-        </w:tc>
-        <w:tc>
-          <w:tcPr>
-            <w:tcW w:type="dxa" w:w="3216"/>
-          </w:tcPr>
-          <w:p>
-            <w:pPr>
-              <w:spacing w:before="40" w:after="40"/>
-            </w:pPr>
-            <w:r/>
-            <w:r>
-              <w:rPr>
-                <w:color w:val="1D1D1D"/>
-                <w:sz w:val="19"/>
-              </w:rPr>
-              <w:t>Skills and organisation</w:t>
-            </w:r>
-          </w:p>
-        </w:tc>
-        <w:tc>
-          <w:tcPr>
-            <w:tcW w:type="dxa" w:w="3216"/>
-          </w:tcPr>
-          <w:p>
-            <w:pPr>
-              <w:spacing w:before="40" w:after="40"/>
-            </w:pPr>
-            <w:r/>
-            <w:r>
-              <w:rPr>
-                <w:color w:val="1D1D1D"/>
-                <w:sz w:val="19"/>
-              </w:rPr>
-              <w:t>3.3 / 5</w:t>
-            </w:r>
-          </w:p>
-        </w:tc>
-      </w:tr>
-      <w:tr>
-        <w:tc>
-          <w:tcPr>
-            <w:tcW w:type="dxa" w:w="3216"/>
-            <w:shd w:val="clear" w:fill="F4F4F4"/>
-          </w:tcPr>
-          <w:p>
-            <w:pPr>
-              <w:spacing w:before="40" w:after="40"/>
-            </w:pPr>
-            <w:r/>
-            <w:r>
-              <w:rPr>
-                <w:color w:val="1D1D1D"/>
-                <w:sz w:val="19"/>
-              </w:rPr>
-              <w:t>4</w:t>
-            </w:r>
-          </w:p>
-        </w:tc>
-        <w:tc>
-          <w:tcPr>
-            <w:tcW w:type="dxa" w:w="3216"/>
-            <w:shd w:val="clear" w:fill="F4F4F4"/>
-          </w:tcPr>
-          <w:p>
-            <w:pPr>
-              <w:spacing w:before="40" w:after="40"/>
-            </w:pPr>
-            <w:r/>
-            <w:r>
-              <w:rPr>
-                <w:color w:val="1D1D1D"/>
-                <w:sz w:val="19"/>
-              </w:rPr>
-              <w:t>Business use case clarity</w:t>
-            </w:r>
-          </w:p>
-        </w:tc>
-        <w:tc>
-          <w:tcPr>
-            <w:tcW w:type="dxa" w:w="3216"/>
-            <w:shd w:val="clear" w:fill="F4F4F4"/>
-          </w:tcPr>
-          <w:p>
-            <w:pPr>
-              <w:spacing w:before="40" w:after="40"/>
-            </w:pPr>
-            <w:r/>
-            <w:r>
-              <w:rPr>
-                <w:color w:val="1D1D1D"/>
-                <w:sz w:val="19"/>
-              </w:rPr>
-              <w:t>4.2 / 5</w:t>
-            </w:r>
-          </w:p>
-        </w:tc>
-      </w:tr>
-      <w:tr>
-        <w:tc>
-          <w:tcPr>
-            <w:tcW w:type="dxa" w:w="3216"/>
-          </w:tcPr>
-          <w:p>
-            <w:pPr>
-              <w:spacing w:before="40" w:after="40"/>
-            </w:pPr>
-            <w:r/>
-            <w:r>
-              <w:rPr>
-                <w:color w:val="1D1D1D"/>
-                <w:sz w:val="19"/>
-              </w:rPr>
-              <w:t>5</w:t>
-            </w:r>
-          </w:p>
-        </w:tc>
-        <w:tc>
-          <w:tcPr>
-            <w:tcW w:type="dxa" w:w="3216"/>
-          </w:tcPr>
-          <w:p>
-            <w:pPr>
-              <w:spacing w:before="40" w:after="40"/>
-            </w:pPr>
-            <w:r/>
-            <w:r>
-              <w:rPr>
-                <w:color w:val="1D1D1D"/>
-                <w:sz w:val="19"/>
-              </w:rPr>
-              <w:t>Technical infrastructure</w:t>
-            </w:r>
-          </w:p>
-        </w:tc>
-        <w:tc>
-          <w:tcPr>
-            <w:tcW w:type="dxa" w:w="3216"/>
-          </w:tcPr>
-          <w:p>
-            <w:pPr>
-              <w:spacing w:before="40" w:after="40"/>
-            </w:pPr>
-            <w:r/>
-            <w:r>
-              <w:rPr>
-                <w:color w:val="1D1D1D"/>
-                <w:sz w:val="19"/>
-              </w:rPr>
-              <w:t>3.0 / 5</w:t>
-            </w:r>
-          </w:p>
-        </w:tc>
-      </w:tr>
-    </w:tbl>
-    <w:p/>
     <w:p>
       <w:pPr>
         <w:spacing w:after="140"/>
       </w:pPr>
       <w:r>
         <w:rPr>
+          <w:b/>
           <w:color w:val="1D1D1D"/>
           <w:sz w:val="21"/>
         </w:rPr>
-        <w:t>One dimension below the threshold, and it is governance. For a customer that finding would be</w:t>
+        <w:t>The strongest dimension, and the reason the BDC conversation is worth having.</w:t>
+      </w:r>
+      <w:r>
+        <w:rPr>
+          <w:color w:val="1D1D1D"/>
+          <w:sz w:val="21"/>
+        </w:rPr>
+        <w:t xml:space="preserve"> Seven</w:t>
       </w:r>
     </w:p>
     <w:p>
@@ -2488,7 +733,7 @@
           <w:color w:val="1D1D1D"/>
           <w:sz w:val="21"/>
         </w:rPr>
-        <w:t>uncomfortable; for us it is the point. We built working AI on data we harmonised by hand, with</w:t>
+        <w:t>scenarios are built and running, each ranked by euros at stake weighted by model confidence —</w:t>
       </w:r>
     </w:p>
     <w:p>
@@ -2500,7 +745,7 @@
           <w:color w:val="1D1D1D"/>
           <w:sz w:val="21"/>
         </w:rPr>
-        <w:t>no ownership, no catalogue and no lineage. That is a demo. It is not a landscape anyone can run</w:t>
+        <w:t>the prioritisation is not a slide, it is a live query. The AI use cases are implemented rather</w:t>
       </w:r>
     </w:p>
     <w:p>
@@ -2512,7 +757,209 @@
           <w:color w:val="1D1D1D"/>
           <w:sz w:val="21"/>
         </w:rPr>
-        <w:t>an agent against, and no amount of additional model quality fixes it.</w:t>
+        <w:t>than merely identified, and the business sponsor is engaged and specific.</w:t>
+      </w:r>
+    </w:p>
+    <w:p>
+      <w:pPr>
+        <w:spacing w:after="140"/>
+      </w:pPr>
+      <w:r>
+        <w:rPr>
+          <w:color w:val="1D1D1D"/>
+          <w:sz w:val="21"/>
+        </w:rPr>
+        <w:t>The one soft spot is target-setting. Value at stake, skill against a seasonal-naive benchmark</w:t>
+      </w:r>
+    </w:p>
+    <w:p>
+      <w:pPr>
+        <w:spacing w:after="140"/>
+      </w:pPr>
+      <w:r>
+        <w:rPr>
+          <w:color w:val="1D1D1D"/>
+          <w:sz w:val="21"/>
+        </w:rPr>
+        <w:t>and signed bias are all measured, but no threshold has been agreed that would say the system is</w:t>
+      </w:r>
+    </w:p>
+    <w:p>
+      <w:pPr>
+        <w:spacing w:after="140"/>
+      </w:pPr>
+      <w:r>
+        <w:rPr>
+          <w:color w:val="1D1D1D"/>
+          <w:sz w:val="21"/>
+        </w:rPr>
+        <w:t>performing well enough. We can tell you the number; we have not agreed what a good number is.</w:t>
+      </w:r>
+    </w:p>
+    <w:p>
+      <w:pPr>
+        <w:pStyle w:val="Heading3"/>
+      </w:pPr>
+      <w:r>
+        <w:rPr>
+          <w:b/>
+          <w:color w:val="1D1D1D"/>
+          <w:sz w:val="23"/>
+        </w:rPr>
+        <w:t>Dimension 5 — Technical infrastructure</w:t>
+      </w:r>
+    </w:p>
+    <w:p>
+      <w:pPr>
+        <w:spacing w:after="140"/>
+      </w:pPr>
+      <w:r>
+        <w:rPr>
+          <w:b/>
+          <w:color w:val="1D1D1D"/>
+          <w:sz w:val="21"/>
+        </w:rPr>
+        <w:t>In place for an application, not for a data platform.</w:t>
+      </w:r>
+      <w:r>
+        <w:rPr>
+          <w:color w:val="1D1D1D"/>
+          <w:sz w:val="21"/>
+        </w:rPr>
+        <w:t xml:space="preserve"> The BTP landscape is complete: Cloud</w:t>
+      </w:r>
+    </w:p>
+    <w:p>
+      <w:pPr>
+        <w:spacing w:after="140"/>
+      </w:pPr>
+      <w:r>
+        <w:rPr>
+          <w:color w:val="1D1D1D"/>
+          <w:sz w:val="21"/>
+        </w:rPr>
+        <w:t>Foundry org and space, HANA Cloud instance, HDI container, MTA deployment. Security is properly</w:t>
+      </w:r>
+    </w:p>
+    <w:p>
+      <w:pPr>
+        <w:spacing w:after="140"/>
+      </w:pPr>
+      <w:r>
+        <w:rPr>
+          <w:color w:val="1D1D1D"/>
+          <w:sz w:val="21"/>
+        </w:rPr>
+        <w:t>done — XSUAA with three role templates and three role collections, the Application Router</w:t>
+      </w:r>
+    </w:p>
+    <w:p>
+      <w:pPr>
+        <w:spacing w:after="140"/>
+      </w:pPr>
+      <w:r>
+        <w:rPr>
+          <w:color w:val="1D1D1D"/>
+          <w:sz w:val="21"/>
+        </w:rPr>
+        <w:t>fronting both services, destinations with token forwarding.</w:t>
+      </w:r>
+    </w:p>
+    <w:p>
+      <w:pPr>
+        <w:spacing w:after="140"/>
+      </w:pPr>
+      <w:r>
+        <w:rPr>
+          <w:color w:val="1D1D1D"/>
+          <w:sz w:val="21"/>
+        </w:rPr>
+        <w:t>What is missing is everything platform-shaped. No CPI or Integration Suite; every integration is</w:t>
+      </w:r>
+    </w:p>
+    <w:p>
+      <w:pPr>
+        <w:spacing w:after="140"/>
+      </w:pPr>
+      <w:r>
+        <w:rPr>
+          <w:color w:val="1D1D1D"/>
+          <w:sz w:val="21"/>
+        </w:rPr>
+        <w:t>file-based or direct. The HANA Cloud entitlement is in place, but there is no BDC entitlement.</w:t>
+      </w:r>
+    </w:p>
+    <w:p>
+      <w:pPr>
+        <w:pStyle w:val="Heading3"/>
+      </w:pPr>
+      <w:r>
+        <w:rPr>
+          <w:b/>
+          <w:color w:val="1D1D1D"/>
+          <w:sz w:val="23"/>
+        </w:rPr>
+        <w:t>What the assessment produces</w:t>
+      </w:r>
+    </w:p>
+    <w:p>
+      <w:pPr>
+        <w:spacing w:after="140"/>
+      </w:pPr>
+      <w:r>
+        <w:rPr>
+          <w:color w:val="1D1D1D"/>
+          <w:sz w:val="21"/>
+        </w:rPr>
+        <w:t>Four dimensions are in reasonable shape. One is not, and it is governance.</w:t>
+      </w:r>
+    </w:p>
+    <w:p>
+      <w:pPr>
+        <w:spacing w:after="140"/>
+      </w:pPr>
+      <w:r>
+        <w:rPr>
+          <w:color w:val="1D1D1D"/>
+          <w:sz w:val="21"/>
+        </w:rPr>
+        <w:t>For a customer that finding would be uncomfortable; for us it is the point. We built seven</w:t>
+      </w:r>
+    </w:p>
+    <w:p>
+      <w:pPr>
+        <w:spacing w:after="140"/>
+      </w:pPr>
+      <w:r>
+        <w:rPr>
+          <w:color w:val="1D1D1D"/>
+          <w:sz w:val="21"/>
+        </w:rPr>
+        <w:t>working AI scenarios on data we harmonised by hand, with no ownership, no catalogue and no</w:t>
+      </w:r>
+    </w:p>
+    <w:p>
+      <w:pPr>
+        <w:spacing w:after="140"/>
+      </w:pPr>
+      <w:r>
+        <w:rPr>
+          <w:color w:val="1D1D1D"/>
+          <w:sz w:val="21"/>
+        </w:rPr>
+        <w:t>lineage. That is a demo. It is not a landscape anyone can point an agent at, and no amount of</w:t>
+      </w:r>
+    </w:p>
+    <w:p>
+      <w:pPr>
+        <w:spacing w:after="140"/>
+      </w:pPr>
+      <w:r>
+        <w:rPr>
+          <w:color w:val="1D1D1D"/>
+          <w:sz w:val="21"/>
+        </w:rPr>
+        <w:t>additional model quality fixes it.</w:t>
       </w:r>
     </w:p>
     <w:p>

</xml_diff>

<commit_message>
Join the wrapped source lines into real paragraphs in the Word build
The markdown is hard-wrapped at about 95 characters for readability, and the
renderer was turning every one of those source lines into its own Word
paragraph. Word then wrapped nothing, so the text sat in short ragged lines
with most of the right margin unused and paragraph spacing between them.

Consecutive lines are now joined back into a single paragraph and left for
Word to wrap, with 1.15 line spacing. 125 paragraphs become 55, median length
162 characters. Also added italic runs, which the assessment uses for the
sub-criteria labels and which were previously rendered with their asterisks
showing.
</commit_message>
<xml_diff>
--- a/docs/SMart_BDC_Readiness_and_Architecture.docx
+++ b/docs/SMart_BDC_Readiness_and_Architecture.docx
@@ -14,38 +14,14 @@
     </w:p>
     <w:p>
       <w:pPr>
-        <w:spacing w:after="140"/>
+        <w:spacing w:after="160" w:line="276" w:lineRule="auto"/>
       </w:pPr>
       <w:r>
         <w:rPr>
           <w:color w:val="1D1D1D"/>
           <w:sz w:val="21"/>
         </w:rPr>
-        <w:t>Readiness scorecard and target architecture. A worked example of the BDC Readiness Assessment</w:t>
-      </w:r>
-    </w:p>
-    <w:p>
-      <w:pPr>
-        <w:spacing w:after="140"/>
-      </w:pPr>
-      <w:r>
-        <w:rPr>
-          <w:color w:val="1D1D1D"/>
-          <w:sz w:val="21"/>
-        </w:rPr>
-        <w:t>framework applied to our own landscape, and what the BTP-plus-BDC version of this demo would</w:t>
-      </w:r>
-    </w:p>
-    <w:p>
-      <w:pPr>
-        <w:spacing w:after="140"/>
-      </w:pPr>
-      <w:r>
-        <w:rPr>
-          <w:color w:val="1D1D1D"/>
-          <w:sz w:val="21"/>
-        </w:rPr>
-        <w:t>look like.</w:t>
+        <w:t>Readiness scorecard and target architecture. A worked example of the BDC Readiness Assessment framework applied to our own landscape, and what the BTP-plus-BDC version of this demo would look like.</w:t>
       </w:r>
     </w:p>
     <w:p>
@@ -63,110 +39,38 @@
     </w:p>
     <w:p>
       <w:pPr>
-        <w:spacing w:after="140"/>
+        <w:spacing w:after="160" w:line="276" w:lineRule="auto"/>
       </w:pPr>
       <w:r>
         <w:rPr>
           <w:color w:val="1D1D1D"/>
           <w:sz w:val="21"/>
         </w:rPr>
-        <w:t>The readiness framework in the BDC starter kit is written for a customer estate: an existing BW</w:t>
+        <w:t>The readiness framework in the BDC starter kit is written for a customer estate: an existing BW landscape, real data owners, a live extraction pipeline. Ours is a demo built on BTP with no legacy behind it, so several criteria do not apply in the form they are asked.</w:t>
       </w:r>
     </w:p>
     <w:p>
       <w:pPr>
-        <w:spacing w:after="140"/>
+        <w:spacing w:after="160" w:line="276" w:lineRule="auto"/>
       </w:pPr>
       <w:r>
         <w:rPr>
           <w:color w:val="1D1D1D"/>
           <w:sz w:val="21"/>
         </w:rPr>
-        <w:t>landscape, real data owners, a live extraction pipeline. Ours is a demo built on BTP with no</w:t>
+        <w:t>This assessment works through all five dimensions anyway, on the closest honest equivalent, and says so wherever a criterion has been substituted or cannot be answered at all. It is written as findings rather than scores: a number out of five invites an argument about the number, and the useful output here is what is actually missing.</w:t>
       </w:r>
     </w:p>
     <w:p>
       <w:pPr>
-        <w:spacing w:after="140"/>
+        <w:spacing w:after="160" w:line="276" w:lineRule="auto"/>
       </w:pPr>
       <w:r>
         <w:rPr>
           <w:color w:val="1D1D1D"/>
           <w:sz w:val="21"/>
         </w:rPr>
-        <w:t>legacy behind it, so several criteria do not apply in the form they are asked.</w:t>
-      </w:r>
-    </w:p>
-    <w:p>
-      <w:pPr>
-        <w:spacing w:after="140"/>
-      </w:pPr>
-      <w:r>
-        <w:rPr>
-          <w:color w:val="1D1D1D"/>
-          <w:sz w:val="21"/>
-        </w:rPr>
-        <w:t>This assessment works through all five dimensions anyway, on the closest honest equivalent, and</w:t>
-      </w:r>
-    </w:p>
-    <w:p>
-      <w:pPr>
-        <w:spacing w:after="140"/>
-      </w:pPr>
-      <w:r>
-        <w:rPr>
-          <w:color w:val="1D1D1D"/>
-          <w:sz w:val="21"/>
-        </w:rPr>
-        <w:t>says so wherever a criterion has been substituted or cannot be answered at all. It is written as</w:t>
-      </w:r>
-    </w:p>
-    <w:p>
-      <w:pPr>
-        <w:spacing w:after="140"/>
-      </w:pPr>
-      <w:r>
-        <w:rPr>
-          <w:color w:val="1D1D1D"/>
-          <w:sz w:val="21"/>
-        </w:rPr>
-        <w:t>findings rather than scores: a number out of five invites an argument about the number, and the</w:t>
-      </w:r>
-    </w:p>
-    <w:p>
-      <w:pPr>
-        <w:spacing w:after="140"/>
-      </w:pPr>
-      <w:r>
-        <w:rPr>
-          <w:color w:val="1D1D1D"/>
-          <w:sz w:val="21"/>
-        </w:rPr>
-        <w:t>useful output here is what is actually missing.</w:t>
-      </w:r>
-    </w:p>
-    <w:p>
-      <w:pPr>
-        <w:spacing w:after="140"/>
-      </w:pPr>
-      <w:r>
-        <w:rPr>
-          <w:color w:val="1D1D1D"/>
-          <w:sz w:val="21"/>
-        </w:rPr>
-        <w:t>The result is more useful than a flattering one. Applied honestly, the framework identifies a</w:t>
-      </w:r>
-    </w:p>
-    <w:p>
-      <w:pPr>
-        <w:spacing w:after="140"/>
-      </w:pPr>
-      <w:r>
-        <w:rPr>
-          <w:color w:val="1D1D1D"/>
-          <w:sz w:val="21"/>
-        </w:rPr>
-        <w:t>single weak dimension, and it is exactly the one BDC is sold to fix.</w:t>
+        <w:t>The result is more useful than a flattering one. Applied honestly, the framework identifies a single weak dimension, and it is exactly the one BDC is sold to fix.</w:t>
       </w:r>
     </w:p>
     <w:p>
@@ -197,7 +101,7 @@
     </w:p>
     <w:p>
       <w:pPr>
-        <w:spacing w:after="140"/>
+        <w:spacing w:after="160" w:line="276" w:lineRule="auto"/>
       </w:pPr>
       <w:r>
         <w:rPr>
@@ -212,91 +116,19 @@
           <w:color w:val="1D1D1D"/>
           <w:sz w:val="21"/>
         </w:rPr>
-        <w:t xml:space="preserve"> There is no BW estate to</w:t>
+        <w:t xml:space="preserve"> There is no BW estate to untangle and no custom ABAP, so two of the four criteria do not apply. Volumes and ingestion are in good shape: 25 tables and 120,324 rows deployed to HANA Cloud, with incremental ingestion supported and exercised — the pipeline picks its primary source by row count rather than filename, and a single-day export drives the delta path.</w:t>
       </w:r>
     </w:p>
     <w:p>
       <w:pPr>
-        <w:spacing w:after="140"/>
+        <w:spacing w:after="160" w:line="276" w:lineRule="auto"/>
       </w:pPr>
       <w:r>
         <w:rPr>
           <w:color w:val="1D1D1D"/>
           <w:sz w:val="21"/>
         </w:rPr>
-        <w:t>untangle and no custom ABAP, so two of the four criteria do not apply. Volumes and ingestion are</w:t>
-      </w:r>
-    </w:p>
-    <w:p>
-      <w:pPr>
-        <w:spacing w:after="140"/>
-      </w:pPr>
-      <w:r>
-        <w:rPr>
-          <w:color w:val="1D1D1D"/>
-          <w:sz w:val="21"/>
-        </w:rPr>
-        <w:t>in good shape: 25 tables and 120,324 rows deployed to HANA Cloud, with incremental ingestion</w:t>
-      </w:r>
-    </w:p>
-    <w:p>
-      <w:pPr>
-        <w:spacing w:after="140"/>
-      </w:pPr>
-      <w:r>
-        <w:rPr>
-          <w:color w:val="1D1D1D"/>
-          <w:sz w:val="21"/>
-        </w:rPr>
-        <w:t>supported and exercised — the pipeline picks its primary source by row count rather than</w:t>
-      </w:r>
-    </w:p>
-    <w:p>
-      <w:pPr>
-        <w:spacing w:after="140"/>
-      </w:pPr>
-      <w:r>
-        <w:rPr>
-          <w:color w:val="1D1D1D"/>
-          <w:sz w:val="21"/>
-        </w:rPr>
-        <w:t>filename, and a single-day export drives the delta path.</w:t>
-      </w:r>
-    </w:p>
-    <w:p>
-      <w:pPr>
-        <w:spacing w:after="140"/>
-      </w:pPr>
-      <w:r>
-        <w:rPr>
-          <w:color w:val="1D1D1D"/>
-          <w:sz w:val="21"/>
-        </w:rPr>
-        <w:t>There is no ECC or S/4 extraction landscape. The source is a file-based SAP Customer Checkout</w:t>
-      </w:r>
-    </w:p>
-    <w:p>
-      <w:pPr>
-        <w:spacing w:after="140"/>
-      </w:pPr>
-      <w:r>
-        <w:rPr>
-          <w:color w:val="1D1D1D"/>
-          <w:sz w:val="21"/>
-        </w:rPr>
-        <w:t>export whose figures reconciled exactly against the totals SAP prints in its own report when</w:t>
-      </w:r>
-    </w:p>
-    <w:p>
-      <w:pPr>
-        <w:spacing w:after="140"/>
-      </w:pPr>
-      <w:r>
-        <w:rPr>
-          <w:color w:val="1D1D1D"/>
-          <w:sz w:val="21"/>
-        </w:rPr>
-        <w:t xml:space="preserve">checked by hand, with those totals captured in </w:t>
+        <w:t xml:space="preserve">There is no ECC or S/4 extraction landscape. The source is a file-based SAP Customer Checkout export whose figures reconciled exactly against the totals SAP prints in its own report when checked by hand, with those totals captured in </w:t>
       </w:r>
       <w:r>
         <w:rPr>
@@ -311,24 +143,12 @@
           <w:color w:val="1D1D1D"/>
           <w:sz w:val="21"/>
         </w:rPr>
-        <w:t xml:space="preserve"> on every run. The</w:t>
+        <w:t xml:space="preserve"> on every run. The comparison itself is not automated, which is a dimension 2 problem.</w:t>
       </w:r>
     </w:p>
     <w:p>
       <w:pPr>
-        <w:spacing w:after="140"/>
-      </w:pPr>
-      <w:r>
-        <w:rPr>
-          <w:color w:val="1D1D1D"/>
-          <w:sz w:val="21"/>
-        </w:rPr>
-        <w:t>comparison itself is not automated, which is a dimension 2 problem.</w:t>
-      </w:r>
-    </w:p>
-    <w:p>
-      <w:pPr>
-        <w:spacing w:after="140"/>
+        <w:spacing w:after="160" w:line="276" w:lineRule="auto"/>
       </w:pPr>
       <w:r>
         <w:rPr>
@@ -353,7 +173,7 @@
     </w:p>
     <w:p>
       <w:pPr>
-        <w:spacing w:after="140"/>
+        <w:spacing w:after="160" w:line="276" w:lineRule="auto"/>
       </w:pPr>
       <w:r>
         <w:rPr>
@@ -366,26 +186,22 @@
     </w:p>
     <w:p>
       <w:pPr>
-        <w:spacing w:after="140"/>
+        <w:spacing w:after="160" w:line="276" w:lineRule="auto"/>
       </w:pPr>
+      <w:r>
+        <w:rPr>
+          <w:i/>
+          <w:color w:val="1D1D1D"/>
+          <w:sz w:val="21"/>
+        </w:rPr>
+        <w:t>Ownership:</w:t>
+      </w:r>
       <w:r>
         <w:rPr>
           <w:color w:val="1D1D1D"/>
           <w:sz w:val="21"/>
         </w:rPr>
-        <w:t>*Ownership:* absent. Nothing assigns an owner, steward or accountable party to any entity —</w:t>
-      </w:r>
-    </w:p>
-    <w:p>
-      <w:pPr>
-        <w:spacing w:after="140"/>
-      </w:pPr>
-      <w:r>
-        <w:rPr>
-          <w:color w:val="1D1D1D"/>
-          <w:sz w:val="21"/>
-        </w:rPr>
-        <w:t xml:space="preserve">there is no </w:t>
+        <w:t xml:space="preserve"> absent. Nothing assigns an owner, steward or accountable party to any entity — there is no </w:t>
       </w:r>
       <w:r>
         <w:rPr>
@@ -405,62 +221,42 @@
     </w:p>
     <w:p>
       <w:pPr>
-        <w:spacing w:after="140"/>
+        <w:spacing w:after="160" w:line="276" w:lineRule="auto"/>
       </w:pPr>
+      <w:r>
+        <w:rPr>
+          <w:i/>
+          <w:color w:val="1D1D1D"/>
+          <w:sz w:val="21"/>
+        </w:rPr>
+        <w:t>Master data governance:</w:t>
+      </w:r>
       <w:r>
         <w:rPr>
           <w:color w:val="1D1D1D"/>
           <w:sz w:val="21"/>
         </w:rPr>
-        <w:t>*Master data governance:* the article master was enriched by us — unit cost, temperature zone,</w:t>
+        <w:t xml:space="preserve"> the article master was enriched by us — unit cost, temperature zone, shelf life, ABC class, RFID flag, reorder point, supplier — under a fixed seed, so the values are reproducible and documented. But there is no source of record, no approval step and no change process. The values are defensible; the process does not exist.</w:t>
       </w:r>
     </w:p>
     <w:p>
       <w:pPr>
-        <w:spacing w:after="140"/>
+        <w:spacing w:after="160" w:line="276" w:lineRule="auto"/>
       </w:pPr>
+      <w:r>
+        <w:rPr>
+          <w:i/>
+          <w:color w:val="1D1D1D"/>
+          <w:sz w:val="21"/>
+        </w:rPr>
+        <w:t>Data quality monitoring:</w:t>
+      </w:r>
       <w:r>
         <w:rPr>
           <w:color w:val="1D1D1D"/>
           <w:sz w:val="21"/>
         </w:rPr>
-        <w:t>shelf life, ABC class, RFID flag, reorder point, supplier — under a fixed seed, so the values</w:t>
-      </w:r>
-    </w:p>
-    <w:p>
-      <w:pPr>
-        <w:spacing w:after="140"/>
-      </w:pPr>
-      <w:r>
-        <w:rPr>
-          <w:color w:val="1D1D1D"/>
-          <w:sz w:val="21"/>
-        </w:rPr>
-        <w:t>are reproducible and documented. But there is no source of record, no approval step and no</w:t>
-      </w:r>
-    </w:p>
-    <w:p>
-      <w:pPr>
-        <w:spacing w:after="140"/>
-      </w:pPr>
-      <w:r>
-        <w:rPr>
-          <w:color w:val="1D1D1D"/>
-          <w:sz w:val="21"/>
-        </w:rPr>
-        <w:t>change process. The values are defensible; the process does not exist.</w:t>
-      </w:r>
-    </w:p>
-    <w:p>
-      <w:pPr>
-        <w:spacing w:after="140"/>
-      </w:pPr>
-      <w:r>
-        <w:rPr>
-          <w:color w:val="1D1D1D"/>
-          <w:sz w:val="21"/>
-        </w:rPr>
-        <w:t xml:space="preserve">*Data quality monitoring:* weaker than it first appears. </w:t>
+        <w:t xml:space="preserve"> weaker than it first appears. </w:t>
       </w:r>
       <w:r>
         <w:rPr>
@@ -475,115 +271,39 @@
           <w:color w:val="1D1D1D"/>
           <w:sz w:val="21"/>
         </w:rPr>
-        <w:t xml:space="preserve"> reads SAP's own</w:t>
+        <w:t xml:space="preserve"> reads SAP's own totals into the manifest on every run, but nothing compares them to the extracted rows. There is no assertion and no failure on mismatch — the only hard exits in the pipeline are for a missing dependency and an empty source directory. The reconciliation was verified once, by hand, and the figures are recorded for inspection. A recorded figure is not a control.</w:t>
       </w:r>
     </w:p>
     <w:p>
       <w:pPr>
-        <w:spacing w:after="140"/>
+        <w:spacing w:after="160" w:line="276" w:lineRule="auto"/>
+      </w:pPr>
+      <w:r>
+        <w:rPr>
+          <w:i/>
+          <w:color w:val="1D1D1D"/>
+          <w:sz w:val="21"/>
+        </w:rPr>
+        <w:t>Catalogue and lineage:</w:t>
+      </w:r>
+      <w:r>
+        <w:rPr>
+          <w:color w:val="1D1D1D"/>
+          <w:sz w:val="21"/>
+        </w:rPr>
+        <w:t xml:space="preserve"> absent. No catalogue, no glossary, no lineage tooling. Lineage exists only as prose in the project report.</w:t>
+      </w:r>
+    </w:p>
+    <w:p>
+      <w:pPr>
+        <w:spacing w:after="160" w:line="276" w:lineRule="auto"/>
       </w:pPr>
       <w:r>
         <w:rPr>
           <w:color w:val="1D1D1D"/>
           <w:sz w:val="21"/>
         </w:rPr>
-        <w:t>totals into the manifest on every run, but nothing compares them to the extracted rows. There is</w:t>
-      </w:r>
-    </w:p>
-    <w:p>
-      <w:pPr>
-        <w:spacing w:after="140"/>
-      </w:pPr>
-      <w:r>
-        <w:rPr>
-          <w:color w:val="1D1D1D"/>
-          <w:sz w:val="21"/>
-        </w:rPr>
-        <w:t>no assertion and no failure on mismatch — the only hard exits in the pipeline are for a missing</w:t>
-      </w:r>
-    </w:p>
-    <w:p>
-      <w:pPr>
-        <w:spacing w:after="140"/>
-      </w:pPr>
-      <w:r>
-        <w:rPr>
-          <w:color w:val="1D1D1D"/>
-          <w:sz w:val="21"/>
-        </w:rPr>
-        <w:t>dependency and an empty source directory. The reconciliation was verified once, by hand, and the</w:t>
-      </w:r>
-    </w:p>
-    <w:p>
-      <w:pPr>
-        <w:spacing w:after="140"/>
-      </w:pPr>
-      <w:r>
-        <w:rPr>
-          <w:color w:val="1D1D1D"/>
-          <w:sz w:val="21"/>
-        </w:rPr>
-        <w:t>figures are recorded for inspection. A recorded figure is not a control.</w:t>
-      </w:r>
-    </w:p>
-    <w:p>
-      <w:pPr>
-        <w:spacing w:after="140"/>
-      </w:pPr>
-      <w:r>
-        <w:rPr>
-          <w:color w:val="1D1D1D"/>
-          <w:sz w:val="21"/>
-        </w:rPr>
-        <w:t>*Catalogue and lineage:* absent. No catalogue, no glossary, no lineage tooling. Lineage exists</w:t>
-      </w:r>
-    </w:p>
-    <w:p>
-      <w:pPr>
-        <w:spacing w:after="140"/>
-      </w:pPr>
-      <w:r>
-        <w:rPr>
-          <w:color w:val="1D1D1D"/>
-          <w:sz w:val="21"/>
-        </w:rPr>
-        <w:t>only as prose in the project report.</w:t>
-      </w:r>
-    </w:p>
-    <w:p>
-      <w:pPr>
-        <w:spacing w:after="140"/>
-      </w:pPr>
-      <w:r>
-        <w:rPr>
-          <w:color w:val="1D1D1D"/>
-          <w:sz w:val="21"/>
-        </w:rPr>
-        <w:t>This is the workstream the assessment produces, and it is precisely what a data product is: a</w:t>
-      </w:r>
-    </w:p>
-    <w:p>
-      <w:pPr>
-        <w:spacing w:after="140"/>
-      </w:pPr>
-      <w:r>
-        <w:rPr>
-          <w:color w:val="1D1D1D"/>
-          <w:sz w:val="21"/>
-        </w:rPr>
-        <w:t>governed, owned, catalogued, lineage-tracked unit. The framework applied to us returns the</w:t>
-      </w:r>
-    </w:p>
-    <w:p>
-      <w:pPr>
-        <w:spacing w:after="140"/>
-      </w:pPr>
-      <w:r>
-        <w:rPr>
-          <w:color w:val="1D1D1D"/>
-          <w:sz w:val="21"/>
-        </w:rPr>
-        <w:t>argument for BDC.</w:t>
+        <w:t>This is the workstream the assessment produces, and it is precisely what a data product is: a governed, owned, catalogued, lineage-tracked unit. The framework applied to us returns the argument for BDC.</w:t>
       </w:r>
     </w:p>
     <w:p>
@@ -601,7 +321,7 @@
     </w:p>
     <w:p>
       <w:pPr>
-        <w:spacing w:after="140"/>
+        <w:spacing w:after="160" w:line="276" w:lineRule="auto"/>
       </w:pPr>
       <w:r>
         <w:rPr>
@@ -616,72 +336,24 @@
           <w:color w:val="1D1D1D"/>
           <w:sz w:val="21"/>
         </w:rPr>
-        <w:t xml:space="preserve"> The HANA Cloud side is proven —</w:t>
+        <w:t xml:space="preserve"> The HANA Cloud side is proven — 131 artifacts deployed with 0 warnings, and the CDS model compiled to HANA unchanged. BTP, CAP, CDS, Fiori Elements, XSUAA and the Application Router are all exercised end to end.</w:t>
       </w:r>
     </w:p>
     <w:p>
       <w:pPr>
-        <w:spacing w:after="140"/>
+        <w:spacing w:after="160" w:line="276" w:lineRule="auto"/>
       </w:pPr>
       <w:r>
         <w:rPr>
           <w:color w:val="1D1D1D"/>
           <w:sz w:val="21"/>
         </w:rPr>
-        <w:t>131 artifacts deployed with 0 warnings, and the CDS model compiled to HANA unchanged. BTP, CAP,</w:t>
+        <w:t>BW and SAP Analytics Cloud are both at zero. Data engineering is the strongest part: the ETL handles report-shaped exports properly — metadata rows above the header, group keys printed once per block, total rows mixed in with the real ones — rather than assuming a tidy table.</w:t>
       </w:r>
     </w:p>
     <w:p>
       <w:pPr>
-        <w:spacing w:after="140"/>
-      </w:pPr>
-      <w:r>
-        <w:rPr>
-          <w:color w:val="1D1D1D"/>
-          <w:sz w:val="21"/>
-        </w:rPr>
-        <w:t>CDS, Fiori Elements, XSUAA and the Application Router are all exercised end to end.</w:t>
-      </w:r>
-    </w:p>
-    <w:p>
-      <w:pPr>
-        <w:spacing w:after="140"/>
-      </w:pPr>
-      <w:r>
-        <w:rPr>
-          <w:color w:val="1D1D1D"/>
-          <w:sz w:val="21"/>
-        </w:rPr>
-        <w:t>BW and SAP Analytics Cloud are both at zero. Data engineering is the strongest part: the ETL</w:t>
-      </w:r>
-    </w:p>
-    <w:p>
-      <w:pPr>
-        <w:spacing w:after="140"/>
-      </w:pPr>
-      <w:r>
-        <w:rPr>
-          <w:color w:val="1D1D1D"/>
-          <w:sz w:val="21"/>
-        </w:rPr>
-        <w:t>handles report-shaped exports properly — metadata rows above the header, group keys printed once</w:t>
-      </w:r>
-    </w:p>
-    <w:p>
-      <w:pPr>
-        <w:spacing w:after="140"/>
-      </w:pPr>
-      <w:r>
-        <w:rPr>
-          <w:color w:val="1D1D1D"/>
-          <w:sz w:val="21"/>
-        </w:rPr>
-        <w:t>per block, total rows mixed in with the real ones — rather than assuming a tidy table.</w:t>
-      </w:r>
-    </w:p>
-    <w:p>
-      <w:pPr>
-        <w:spacing w:after="140"/>
+        <w:spacing w:after="160" w:line="276" w:lineRule="auto"/>
       </w:pPr>
       <w:r>
         <w:rPr>
@@ -706,7 +378,7 @@
     </w:p>
     <w:p>
       <w:pPr>
-        <w:spacing w:after="140"/>
+        <w:spacing w:after="160" w:line="276" w:lineRule="auto"/>
       </w:pPr>
       <w:r>
         <w:rPr>
@@ -721,79 +393,19 @@
           <w:color w:val="1D1D1D"/>
           <w:sz w:val="21"/>
         </w:rPr>
-        <w:t xml:space="preserve"> Seven</w:t>
+        <w:t xml:space="preserve"> Seven scenarios are built and running, each ranked by euros at stake weighted by model confidence — the prioritisation is not a slide, it is a live query. The AI use cases are implemented rather than merely identified, and the business sponsor is engaged and specific.</w:t>
       </w:r>
     </w:p>
     <w:p>
       <w:pPr>
-        <w:spacing w:after="140"/>
+        <w:spacing w:after="160" w:line="276" w:lineRule="auto"/>
       </w:pPr>
       <w:r>
         <w:rPr>
           <w:color w:val="1D1D1D"/>
           <w:sz w:val="21"/>
         </w:rPr>
-        <w:t>scenarios are built and running, each ranked by euros at stake weighted by model confidence —</w:t>
-      </w:r>
-    </w:p>
-    <w:p>
-      <w:pPr>
-        <w:spacing w:after="140"/>
-      </w:pPr>
-      <w:r>
-        <w:rPr>
-          <w:color w:val="1D1D1D"/>
-          <w:sz w:val="21"/>
-        </w:rPr>
-        <w:t>the prioritisation is not a slide, it is a live query. The AI use cases are implemented rather</w:t>
-      </w:r>
-    </w:p>
-    <w:p>
-      <w:pPr>
-        <w:spacing w:after="140"/>
-      </w:pPr>
-      <w:r>
-        <w:rPr>
-          <w:color w:val="1D1D1D"/>
-          <w:sz w:val="21"/>
-        </w:rPr>
-        <w:t>than merely identified, and the business sponsor is engaged and specific.</w:t>
-      </w:r>
-    </w:p>
-    <w:p>
-      <w:pPr>
-        <w:spacing w:after="140"/>
-      </w:pPr>
-      <w:r>
-        <w:rPr>
-          <w:color w:val="1D1D1D"/>
-          <w:sz w:val="21"/>
-        </w:rPr>
-        <w:t>The one soft spot is target-setting. Value at stake, skill against a seasonal-naive benchmark</w:t>
-      </w:r>
-    </w:p>
-    <w:p>
-      <w:pPr>
-        <w:spacing w:after="140"/>
-      </w:pPr>
-      <w:r>
-        <w:rPr>
-          <w:color w:val="1D1D1D"/>
-          <w:sz w:val="21"/>
-        </w:rPr>
-        <w:t>and signed bias are all measured, but no threshold has been agreed that would say the system is</w:t>
-      </w:r>
-    </w:p>
-    <w:p>
-      <w:pPr>
-        <w:spacing w:after="140"/>
-      </w:pPr>
-      <w:r>
-        <w:rPr>
-          <w:color w:val="1D1D1D"/>
-          <w:sz w:val="21"/>
-        </w:rPr>
-        <w:t>performing well enough. We can tell you the number; we have not agreed what a good number is.</w:t>
+        <w:t>The one soft spot is target-setting. Value at stake, skill against a seasonal-naive benchmark and signed bias are all measured, but no threshold has been agreed that would say the system is performing well enough. We can tell you the number; we have not agreed what a good number is.</w:t>
       </w:r>
     </w:p>
     <w:p>
@@ -811,7 +423,7 @@
     </w:p>
     <w:p>
       <w:pPr>
-        <w:spacing w:after="140"/>
+        <w:spacing w:after="160" w:line="276" w:lineRule="auto"/>
       </w:pPr>
       <w:r>
         <w:rPr>
@@ -826,67 +438,19 @@
           <w:color w:val="1D1D1D"/>
           <w:sz w:val="21"/>
         </w:rPr>
-        <w:t xml:space="preserve"> The BTP landscape is complete: Cloud</w:t>
+        <w:t xml:space="preserve"> The BTP landscape is complete: Cloud Foundry org and space, HANA Cloud instance, HDI container, MTA deployment. Security is properly done — XSUAA with three role templates and three role collections, the Application Router fronting both services, destinations with token forwarding.</w:t>
       </w:r>
     </w:p>
     <w:p>
       <w:pPr>
-        <w:spacing w:after="140"/>
+        <w:spacing w:after="160" w:line="276" w:lineRule="auto"/>
       </w:pPr>
       <w:r>
         <w:rPr>
           <w:color w:val="1D1D1D"/>
           <w:sz w:val="21"/>
         </w:rPr>
-        <w:t>Foundry org and space, HANA Cloud instance, HDI container, MTA deployment. Security is properly</w:t>
-      </w:r>
-    </w:p>
-    <w:p>
-      <w:pPr>
-        <w:spacing w:after="140"/>
-      </w:pPr>
-      <w:r>
-        <w:rPr>
-          <w:color w:val="1D1D1D"/>
-          <w:sz w:val="21"/>
-        </w:rPr>
-        <w:t>done — XSUAA with three role templates and three role collections, the Application Router</w:t>
-      </w:r>
-    </w:p>
-    <w:p>
-      <w:pPr>
-        <w:spacing w:after="140"/>
-      </w:pPr>
-      <w:r>
-        <w:rPr>
-          <w:color w:val="1D1D1D"/>
-          <w:sz w:val="21"/>
-        </w:rPr>
-        <w:t>fronting both services, destinations with token forwarding.</w:t>
-      </w:r>
-    </w:p>
-    <w:p>
-      <w:pPr>
-        <w:spacing w:after="140"/>
-      </w:pPr>
-      <w:r>
-        <w:rPr>
-          <w:color w:val="1D1D1D"/>
-          <w:sz w:val="21"/>
-        </w:rPr>
-        <w:t>What is missing is everything platform-shaped. No CPI or Integration Suite; every integration is</w:t>
-      </w:r>
-    </w:p>
-    <w:p>
-      <w:pPr>
-        <w:spacing w:after="140"/>
-      </w:pPr>
-      <w:r>
-        <w:rPr>
-          <w:color w:val="1D1D1D"/>
-          <w:sz w:val="21"/>
-        </w:rPr>
-        <w:t>file-based or direct. The HANA Cloud entitlement is in place, but there is no BDC entitlement.</w:t>
+        <w:t>What is missing is everything platform-shaped. No CPI or Integration Suite; every integration is file-based or direct. The HANA Cloud entitlement is in place, but there is no BDC entitlement.</w:t>
       </w:r>
     </w:p>
     <w:p>
@@ -904,7 +468,7 @@
     </w:p>
     <w:p>
       <w:pPr>
-        <w:spacing w:after="140"/>
+        <w:spacing w:after="160" w:line="276" w:lineRule="auto"/>
       </w:pPr>
       <w:r>
         <w:rPr>
@@ -916,50 +480,14 @@
     </w:p>
     <w:p>
       <w:pPr>
-        <w:spacing w:after="140"/>
+        <w:spacing w:after="160" w:line="276" w:lineRule="auto"/>
       </w:pPr>
       <w:r>
         <w:rPr>
           <w:color w:val="1D1D1D"/>
           <w:sz w:val="21"/>
         </w:rPr>
-        <w:t>For a customer that finding would be uncomfortable; for us it is the point. We built seven</w:t>
-      </w:r>
-    </w:p>
-    <w:p>
-      <w:pPr>
-        <w:spacing w:after="140"/>
-      </w:pPr>
-      <w:r>
-        <w:rPr>
-          <w:color w:val="1D1D1D"/>
-          <w:sz w:val="21"/>
-        </w:rPr>
-        <w:t>working AI scenarios on data we harmonised by hand, with no ownership, no catalogue and no</w:t>
-      </w:r>
-    </w:p>
-    <w:p>
-      <w:pPr>
-        <w:spacing w:after="140"/>
-      </w:pPr>
-      <w:r>
-        <w:rPr>
-          <w:color w:val="1D1D1D"/>
-          <w:sz w:val="21"/>
-        </w:rPr>
-        <w:t>lineage. That is a demo. It is not a landscape anyone can point an agent at, and no amount of</w:t>
-      </w:r>
-    </w:p>
-    <w:p>
-      <w:pPr>
-        <w:spacing w:after="140"/>
-      </w:pPr>
-      <w:r>
-        <w:rPr>
-          <w:color w:val="1D1D1D"/>
-          <w:sz w:val="21"/>
-        </w:rPr>
-        <w:t>additional model quality fixes it.</w:t>
+        <w:t>For a customer that finding would be uncomfortable; for us it is the point. We built seven working AI scenarios on data we harmonised by hand, with no ownership, no catalogue and no lineage. That is a demo. It is not a landscape anyone can point an agent at, and no amount of additional model quality fixes it.</w:t>
       </w:r>
     </w:p>
     <w:p>
@@ -977,7 +505,7 @@
     </w:p>
     <w:p>
       <w:pPr>
-        <w:spacing w:after="140"/>
+        <w:spacing w:after="160" w:line="276" w:lineRule="auto"/>
       </w:pPr>
       <w:r>
         <w:rPr>
@@ -990,38 +518,14 @@
     </w:p>
     <w:p>
       <w:pPr>
-        <w:spacing w:after="140"/>
+        <w:spacing w:after="160" w:line="276" w:lineRule="auto"/>
       </w:pPr>
       <w:r>
         <w:rPr>
           <w:color w:val="1D1D1D"/>
           <w:sz w:val="21"/>
         </w:rPr>
-        <w:t>The division is not arbitrary. Engines that want history, scale and non-SAP signal belong where</w:t>
-      </w:r>
-    </w:p>
-    <w:p>
-      <w:pPr>
-        <w:spacing w:after="140"/>
-      </w:pPr>
-      <w:r>
-        <w:rPr>
-          <w:color w:val="1D1D1D"/>
-          <w:sz w:val="21"/>
-        </w:rPr>
-        <w:t>the data lives. Engines that sit behind a button a store manager presses belong next to the</w:t>
-      </w:r>
-    </w:p>
-    <w:p>
-      <w:pPr>
-        <w:spacing w:after="140"/>
-      </w:pPr>
-      <w:r>
-        <w:rPr>
-          <w:color w:val="1D1D1D"/>
-          <w:sz w:val="21"/>
-        </w:rPr>
-        <w:t>transaction.</w:t>
+        <w:t>The division is not arbitrary. Engines that want history, scale and non-SAP signal belong where the data lives. Engines that sit behind a button a store manager presses belong next to the transaction.</w:t>
       </w:r>
     </w:p>
     <w:p>
@@ -1039,7 +543,7 @@
     </w:p>
     <w:p>
       <w:pPr>
-        <w:spacing w:after="140"/>
+        <w:spacing w:after="160" w:line="276" w:lineRule="auto"/>
       </w:pPr>
       <w:r>
         <w:rPr>
@@ -1494,43 +998,19 @@
     <w:p/>
     <w:p>
       <w:pPr>
-        <w:spacing w:after="140"/>
+        <w:spacing w:after="160" w:line="276" w:lineRule="auto"/>
       </w:pPr>
       <w:r>
         <w:rPr>
           <w:color w:val="1D1D1D"/>
           <w:sz w:val="21"/>
         </w:rPr>
-        <w:t>That last row is the part worth demonstrating. Publishing AI output as a governed product shows</w:t>
+        <w:t>That last row is the part worth demonstrating. Publishing AI output as a governed product shows BDC as a two-way fabric rather than a source you read from, and it means a second application consumes our scenario output without reimplementing a line of the logic.</w:t>
       </w:r>
     </w:p>
     <w:p>
       <w:pPr>
-        <w:spacing w:after="140"/>
-      </w:pPr>
-      <w:r>
-        <w:rPr>
-          <w:color w:val="1D1D1D"/>
-          <w:sz w:val="21"/>
-        </w:rPr>
-        <w:t>BDC as a two-way fabric rather than a source you read from, and it means a second application</w:t>
-      </w:r>
-    </w:p>
-    <w:p>
-      <w:pPr>
-        <w:spacing w:after="140"/>
-      </w:pPr>
-      <w:r>
-        <w:rPr>
-          <w:color w:val="1D1D1D"/>
-          <w:sz w:val="21"/>
-        </w:rPr>
-        <w:t>consumes our scenario output without reimplementing a line of the logic.</w:t>
-      </w:r>
-    </w:p>
-    <w:p>
-      <w:pPr>
-        <w:spacing w:after="140"/>
+        <w:spacing w:after="160" w:line="276" w:lineRule="auto"/>
       </w:pPr>
       <w:r>
         <w:rPr>
@@ -1545,55 +1025,7 @@
           <w:color w:val="1D1D1D"/>
           <w:sz w:val="21"/>
         </w:rPr>
-        <w:t>, at least to begin with. Every scenario depends on POS</w:t>
-      </w:r>
-    </w:p>
-    <w:p>
-      <w:pPr>
-        <w:spacing w:after="140"/>
-      </w:pPr>
-      <w:r>
-        <w:rPr>
-          <w:color w:val="1D1D1D"/>
-          <w:sz w:val="21"/>
-        </w:rPr>
-        <w:t>line-item and article-hour grain, and standard retail products are unlikely to reach it.</w:t>
-      </w:r>
-    </w:p>
-    <w:p>
-      <w:pPr>
-        <w:spacing w:after="140"/>
-      </w:pPr>
-      <w:r>
-        <w:rPr>
-          <w:color w:val="1D1D1D"/>
-          <w:sz w:val="21"/>
-        </w:rPr>
-        <w:t>Building our own also demonstrates the capability instead of merely consuming it, which is</w:t>
-      </w:r>
-    </w:p>
-    <w:p>
-      <w:pPr>
-        <w:spacing w:after="140"/>
-      </w:pPr>
-      <w:r>
-        <w:rPr>
-          <w:color w:val="1D1D1D"/>
-          <w:sz w:val="21"/>
-        </w:rPr>
-        <w:t>closer to what the demo needs to prove. Validate against the standard catalogue as we go and</w:t>
-      </w:r>
-    </w:p>
-    <w:p>
-      <w:pPr>
-        <w:spacing w:after="140"/>
-      </w:pPr>
-      <w:r>
-        <w:rPr>
-          <w:color w:val="1D1D1D"/>
-          <w:sz w:val="21"/>
-        </w:rPr>
-        <w:t>switch wherever one genuinely fits.</w:t>
+        <w:t>, at least to begin with. Every scenario depends on POS line-item and article-hour grain, and standard retail products are unlikely to reach it. Building our own also demonstrates the capability instead of merely consuming it, which is closer to what the demo needs to prove. Validate against the standard catalogue as we go and switch wherever one genuinely fits.</w:t>
       </w:r>
     </w:p>
     <w:p>
@@ -2353,26 +1785,14 @@
     <w:p/>
     <w:p>
       <w:pPr>
-        <w:spacing w:after="140"/>
+        <w:spacing w:after="160" w:line="276" w:lineRule="auto"/>
       </w:pPr>
       <w:r>
         <w:rPr>
           <w:color w:val="1D1D1D"/>
           <w:sz w:val="21"/>
         </w:rPr>
-        <w:t>Two of eight move. That is the honest answer, and it is the right one — relocating the other six</w:t>
-      </w:r>
-    </w:p>
-    <w:p>
-      <w:pPr>
-        <w:spacing w:after="140"/>
-      </w:pPr>
-      <w:r>
-        <w:rPr>
-          <w:color w:val="1D1D1D"/>
-          <w:sz w:val="21"/>
-        </w:rPr>
-        <w:t>would add network hops and gain nothing.</w:t>
+        <w:t>Two of eight move. That is the honest answer, and it is the right one — relocating the other six would add network hops and gain nothing.</w:t>
       </w:r>
     </w:p>
     <w:p>
@@ -2390,7 +1810,7 @@
     </w:p>
     <w:p>
       <w:pPr>
-        <w:spacing w:after="140"/>
+        <w:spacing w:after="160" w:line="276" w:lineRule="auto"/>
       </w:pPr>
       <w:r>
         <w:rPr>
@@ -2412,67 +1832,19 @@
           <w:color w:val="1D1D1D"/>
           <w:sz w:val="21"/>
         </w:rPr>
-        <w:t xml:space="preserve"> action call the same engine functions.</w:t>
+        <w:t xml:space="preserve"> action call the same engine functions. There is no second implementation to keep in step, which means an engine can be relocated to Databricks without touching the UI, the service contract, or any other engine. That was a correctness decision when it was made; it turns out to have been an architecture decision.</w:t>
       </w:r>
     </w:p>
     <w:p>
       <w:pPr>
-        <w:spacing w:after="140"/>
+        <w:spacing w:after="160" w:line="276" w:lineRule="auto"/>
       </w:pPr>
       <w:r>
         <w:rPr>
           <w:color w:val="1D1D1D"/>
           <w:sz w:val="21"/>
         </w:rPr>
-        <w:t>There is no second implementation to keep in step, which means an engine can be relocated to</w:t>
-      </w:r>
-    </w:p>
-    <w:p>
-      <w:pPr>
-        <w:spacing w:after="140"/>
-      </w:pPr>
-      <w:r>
-        <w:rPr>
-          <w:color w:val="1D1D1D"/>
-          <w:sz w:val="21"/>
-        </w:rPr>
-        <w:t>Databricks without touching the UI, the service contract, or any other engine. That was a</w:t>
-      </w:r>
-    </w:p>
-    <w:p>
-      <w:pPr>
-        <w:spacing w:after="140"/>
-      </w:pPr>
-      <w:r>
-        <w:rPr>
-          <w:color w:val="1D1D1D"/>
-          <w:sz w:val="21"/>
-        </w:rPr>
-        <w:t>correctness decision when it was made; it turns out to have been an architecture decision.</w:t>
-      </w:r>
-    </w:p>
-    <w:p>
-      <w:pPr>
-        <w:spacing w:after="140"/>
-      </w:pPr>
-      <w:r>
-        <w:rPr>
-          <w:color w:val="1D1D1D"/>
-          <w:sz w:val="21"/>
-        </w:rPr>
-        <w:t>The CDS model also compiled to HANA unchanged — 131 artifacts, 0 warnings — so the semantic</w:t>
-      </w:r>
-    </w:p>
-    <w:p>
-      <w:pPr>
-        <w:spacing w:after="140"/>
-      </w:pPr>
-      <w:r>
-        <w:rPr>
-          <w:color w:val="1D1D1D"/>
-          <w:sz w:val="21"/>
-        </w:rPr>
-        <w:t>layer that would be published as data products is the one already running.</w:t>
+        <w:t>The CDS model also compiled to HANA unchanged — 131 artifacts, 0 warnings — so the semantic layer that would be published as data products is the one already running.</w:t>
       </w:r>
     </w:p>
     <w:p>
@@ -2490,7 +1862,7 @@
     </w:p>
     <w:p>
       <w:pPr>
-        <w:spacing w:after="140"/>
+        <w:spacing w:after="160" w:line="276" w:lineRule="auto"/>
       </w:pPr>
       <w:r>
         <w:rPr>
@@ -2864,38 +2236,14 @@
     <w:p/>
     <w:p>
       <w:pPr>
-        <w:spacing w:after="140"/>
+        <w:spacing w:after="160" w:line="276" w:lineRule="auto"/>
       </w:pPr>
       <w:r>
         <w:rPr>
           <w:color w:val="1D1D1D"/>
           <w:sz w:val="21"/>
         </w:rPr>
-        <w:t>The demo does not need all four. Phase 1 plus the master data family is enough to show a data</w:t>
-      </w:r>
-    </w:p>
-    <w:p>
-      <w:pPr>
-        <w:spacing w:after="140"/>
-      </w:pPr>
-      <w:r>
-        <w:rPr>
-          <w:color w:val="1D1D1D"/>
-          <w:sz w:val="21"/>
-        </w:rPr>
-        <w:t>product being published from a BTP-native application, which is the part of the story that does</w:t>
-      </w:r>
-    </w:p>
-    <w:p>
-      <w:pPr>
-        <w:spacing w:after="140"/>
-      </w:pPr>
-      <w:r>
-        <w:rPr>
-          <w:color w:val="1D1D1D"/>
-          <w:sz w:val="21"/>
-        </w:rPr>
-        <w:t>not exist today.</w:t>
+        <w:t>The demo does not need all four. Phase 1 plus the master data family is enough to show a data product being published from a BTP-native application, which is the part of the story that does not exist today.</w:t>
       </w:r>
     </w:p>
     <w:p>
@@ -2913,50 +2261,26 @@
     </w:p>
     <w:p>
       <w:pPr>
-        <w:spacing w:after="140"/>
+        <w:spacing w:after="160" w:line="276" w:lineRule="auto"/>
       </w:pPr>
       <w:r>
         <w:rPr>
           <w:color w:val="1D1D1D"/>
           <w:sz w:val="21"/>
         </w:rPr>
-        <w:t>Slide 5 of the starter kit maps five source platforms — BW Classic, BW/4HANA, Datasphere/DWC,</w:t>
+        <w:t>Slide 5 of the starter kit maps five source platforms — BW Classic, BW/4HANA, Datasphere/DWC, non-SAP, and on-premise HANA. All five assume a legacy estate to migrate away from.</w:t>
       </w:r>
     </w:p>
     <w:p>
       <w:pPr>
-        <w:spacing w:after="140"/>
+        <w:spacing w:after="160" w:line="276" w:lineRule="auto"/>
       </w:pPr>
       <w:r>
         <w:rPr>
           <w:color w:val="1D1D1D"/>
           <w:sz w:val="21"/>
         </w:rPr>
-        <w:t>non-SAP, and on-premise HANA. All five assume a legacy estate to migrate away from.</w:t>
-      </w:r>
-    </w:p>
-    <w:p>
-      <w:pPr>
-        <w:spacing w:after="140"/>
-      </w:pPr>
-      <w:r>
-        <w:rPr>
-          <w:color w:val="1D1D1D"/>
-          <w:sz w:val="21"/>
-        </w:rPr>
-        <w:t>Ours is a sixth pattern, and if customers are increasingly building on BTP first it will not stay</w:t>
-      </w:r>
-    </w:p>
-    <w:p>
-      <w:pPr>
-        <w:spacing w:after="140"/>
-      </w:pPr>
-      <w:r>
-        <w:rPr>
-          <w:color w:val="1D1D1D"/>
-          <w:sz w:val="21"/>
-        </w:rPr>
-        <w:t>rare:</w:t>
+        <w:t>Ours is a sixth pattern, and if customers are increasingly building on BTP first it will not stay rare:</w:t>
       </w:r>
     </w:p>
     <w:tbl>
@@ -3204,26 +2528,14 @@
     <w:p/>
     <w:p>
       <w:pPr>
-        <w:spacing w:after="140"/>
+        <w:spacing w:after="160" w:line="276" w:lineRule="auto"/>
       </w:pPr>
       <w:r>
         <w:rPr>
           <w:color w:val="1D1D1D"/>
           <w:sz w:val="21"/>
         </w:rPr>
-        <w:t>Complexity is low because there is nothing to migrate. The work is governance and publishing,</w:t>
-      </w:r>
-    </w:p>
-    <w:p>
-      <w:pPr>
-        <w:spacing w:after="140"/>
-      </w:pPr>
-      <w:r>
-        <w:rPr>
-          <w:color w:val="1D1D1D"/>
-          <w:sz w:val="21"/>
-        </w:rPr>
-        <w:t>not conversion — which makes it a good first demonstration rather than a hard one.</w:t>
+        <w:t>Complexity is low because there is nothing to migrate. The work is governance and publishing, not conversion — which makes it a good first demonstration rather than a hard one.</w:t>
       </w:r>
     </w:p>
     <w:p>
@@ -3241,7 +2553,7 @@
     </w:p>
     <w:p>
       <w:pPr>
-        <w:spacing w:after="140"/>
+        <w:spacing w:after="160" w:line="276" w:lineRule="auto"/>
       </w:pPr>
       <w:r>
         <w:rPr>
@@ -3253,110 +2565,38 @@
     </w:p>
     <w:p>
       <w:pPr>
-        <w:spacing w:after="140"/>
+        <w:spacing w:after="160" w:line="276" w:lineRule="auto"/>
       </w:pPr>
       <w:r>
         <w:rPr>
           <w:color w:val="1D1D1D"/>
           <w:sz w:val="21"/>
         </w:rPr>
-        <w:t>It has not been validated against a real BDC tenant. There is no BDC entitlement in the</w:t>
+        <w:t>It has not been validated against a real BDC tenant. There is no BDC entitlement in the subaccount, so the architecture is reasoned from the framework and our own landscape, not tested.</w:t>
       </w:r>
     </w:p>
     <w:p>
       <w:pPr>
-        <w:spacing w:after="140"/>
+        <w:spacing w:after="160" w:line="276" w:lineRule="auto"/>
       </w:pPr>
       <w:r>
         <w:rPr>
           <w:color w:val="1D1D1D"/>
           <w:sz w:val="21"/>
         </w:rPr>
-        <w:t>subaccount, so the architecture is reasoned from the framework and our own landscape, not tested.</w:t>
+        <w:t>The dataset is synthesized on top of a single real store's export. That is sufficient to demonstrate AI scenarios and entirely insufficient to demonstrate landscape harmonization, which by definition needs more than one landscape. A convincing BDC demo would want a second, genuinely non-SAP source.</w:t>
       </w:r>
     </w:p>
     <w:p>
       <w:pPr>
-        <w:spacing w:after="140"/>
+        <w:spacing w:after="160" w:line="276" w:lineRule="auto"/>
       </w:pPr>
       <w:r>
         <w:rPr>
           <w:color w:val="1D1D1D"/>
           <w:sz w:val="21"/>
         </w:rPr>
-        <w:t>The dataset is synthesized on top of a single real store's export. That is sufficient to</w:t>
-      </w:r>
-    </w:p>
-    <w:p>
-      <w:pPr>
-        <w:spacing w:after="140"/>
-      </w:pPr>
-      <w:r>
-        <w:rPr>
-          <w:color w:val="1D1D1D"/>
-          <w:sz w:val="21"/>
-        </w:rPr>
-        <w:t>demonstrate AI scenarios and entirely insufficient to demonstrate landscape harmonization, which</w:t>
-      </w:r>
-    </w:p>
-    <w:p>
-      <w:pPr>
-        <w:spacing w:after="140"/>
-      </w:pPr>
-      <w:r>
-        <w:rPr>
-          <w:color w:val="1D1D1D"/>
-          <w:sz w:val="21"/>
-        </w:rPr>
-        <w:t>by definition needs more than one landscape. A convincing BDC demo would want a second,</w:t>
-      </w:r>
-    </w:p>
-    <w:p>
-      <w:pPr>
-        <w:spacing w:after="140"/>
-      </w:pPr>
-      <w:r>
-        <w:rPr>
-          <w:color w:val="1D1D1D"/>
-          <w:sz w:val="21"/>
-        </w:rPr>
-        <w:t>genuinely non-SAP source.</w:t>
-      </w:r>
-    </w:p>
-    <w:p>
-      <w:pPr>
-        <w:spacing w:after="140"/>
-      </w:pPr>
-      <w:r>
-        <w:rPr>
-          <w:color w:val="1D1D1D"/>
-          <w:sz w:val="21"/>
-        </w:rPr>
-        <w:t>The scores are judgements, not measurements. They are defensible and each one carries its</w:t>
-      </w:r>
-    </w:p>
-    <w:p>
-      <w:pPr>
-        <w:spacing w:after="140"/>
-      </w:pPr>
-      <w:r>
-        <w:rPr>
-          <w:color w:val="1D1D1D"/>
-          <w:sz w:val="21"/>
-        </w:rPr>
-        <w:t>evidence, but a different assessor would move one or two of them by a point. The finding that</w:t>
-      </w:r>
-    </w:p>
-    <w:p>
-      <w:pPr>
-        <w:spacing w:after="140"/>
-      </w:pPr>
-      <w:r>
-        <w:rPr>
-          <w:color w:val="1D1D1D"/>
-          <w:sz w:val="21"/>
-        </w:rPr>
-        <w:t>matters — governance is the weak dimension — is not sensitive to that.</w:t>
+        <w:t>The scores are judgements, not measurements. They are defensible and each one carries its evidence, but a different assessor would move one or two of them by a point. The finding that matters — governance is the weak dimension — is not sensitive to that.</w:t>
       </w:r>
     </w:p>
     <w:sectPr>

</xml_diff>